<commit_message>
Document 13-column question dataset
</commit_message>
<xml_diff>
--- a/Nhom6_Bao_cao.docx
+++ b/Nhom6_Bao_cao.docx
@@ -875,7 +875,7 @@
         <w:pStyle w:val="BT"/>
       </w:pPr>
       <w:r>
-        <w:t>Ba bảng dữ liệu được lập từ Stack Exchange API [1]. Bảng so_monthly_totals.csv có 60 dòng, mỗi dòng gồm số Questions và Answers của một tháng; tổng cộng ghi nhận 4.165.547 câu hỏi và 5.486.140 câu trả lời. Bảng so_questions_sample.csv có 6.000 câu hỏi và 10 trường gốc. Bảng so_tag_counts.csv có 62 dòng cho 31 tag ở hai giai đoạn, gồm 25 tag công nghệ và 6 tag AI/LLM. Thông tin thời điểm thu thập, mốc tháng và hạt giống lấy mẫu được lưu trong collection_info.json.</w:t>
+        <w:t>Ba bảng dữ liệu được lập từ Stack Exchange API [1]. Bảng so_monthly_totals.csv có 60 dòng, mỗi dòng gồm số Questions và Answers của một tháng; tổng cộng ghi nhận 4.165.547 câu hỏi và 5.486.140 câu trả lời. Bảng so_questions_sample.csv có 6.000 câu hỏi và 13 cột: 10 trường gốc từ API, 3 cột được nhóm tính thêm. Bảng so_tag_counts.csv có 62 dòng cho 31 tag ở hai giai đoạn, gồm 25 tag công nghệ và 6 tag AI/LLM. Thông tin thời điểm thu thập, mốc tháng và hạt giống lấy mẫu được lưu trong collection_info.json.</w:t>
       </w:r>
     </w:p>
     <w:p>
@@ -1033,7 +1033,7 @@
               <w:rPr>
                 <w:sz w:val="21"/>
               </w:rPr>
-              <w:t>Month</w:t>
+              <w:t>Id</w:t>
             </w:r>
           </w:p>
         </w:tc>
@@ -1051,7 +1051,7 @@
               <w:rPr>
                 <w:sz w:val="21"/>
               </w:rPr>
-              <w:t>Chuỗi</w:t>
+              <w:t>Số nguyên</w:t>
             </w:r>
           </w:p>
         </w:tc>
@@ -1069,7 +1069,7 @@
               <w:rPr>
                 <w:sz w:val="21"/>
               </w:rPr>
-              <w:t>2021–2025</w:t>
+              <w:t>Duy nhất</w:t>
             </w:r>
           </w:p>
         </w:tc>
@@ -1087,7 +1087,7 @@
               <w:rPr>
                 <w:sz w:val="21"/>
               </w:rPr>
-              <w:t>Tháng đăng bài.</w:t>
+              <w:t>Mã câu hỏi trên Stack Overflow.</w:t>
             </w:r>
           </w:p>
         </w:tc>
@@ -1125,7 +1125,7 @@
               <w:rPr>
                 <w:sz w:val="21"/>
               </w:rPr>
-              <w:t>Questions</w:t>
+              <w:t>PostTypeId</w:t>
             </w:r>
           </w:p>
         </w:tc>
@@ -1161,7 +1161,7 @@
               <w:rPr>
                 <w:sz w:val="21"/>
               </w:rPr>
-              <w:t>≥ 0</w:t>
+              <w:t>1</w:t>
             </w:r>
           </w:p>
         </w:tc>
@@ -1179,7 +1179,7 @@
               <w:rPr>
                 <w:sz w:val="21"/>
               </w:rPr>
-              <w:t>Số câu hỏi đăng mỗi tháng.</w:t>
+              <w:t>Loại bài: câu hỏi.</w:t>
             </w:r>
           </w:p>
         </w:tc>
@@ -1217,7 +1217,7 @@
               <w:rPr>
                 <w:sz w:val="21"/>
               </w:rPr>
-              <w:t>Answers</w:t>
+              <w:t>CreationDate</w:t>
             </w:r>
           </w:p>
         </w:tc>
@@ -1235,7 +1235,7 @@
               <w:rPr>
                 <w:sz w:val="21"/>
               </w:rPr>
-              <w:t>Số nguyên</w:t>
+              <w:t>Ngày giờ</w:t>
             </w:r>
           </w:p>
         </w:tc>
@@ -1253,7 +1253,7 @@
               <w:rPr>
                 <w:sz w:val="21"/>
               </w:rPr>
-              <w:t>≥ 0</w:t>
+              <w:t>2021–2025</w:t>
             </w:r>
           </w:p>
         </w:tc>
@@ -1271,7 +1271,7 @@
               <w:rPr>
                 <w:sz w:val="21"/>
               </w:rPr>
-              <w:t>Số câu trả lời đăng mỗi tháng.</w:t>
+              <w:t>Thời điểm đăng câu hỏi (UTC).</w:t>
             </w:r>
           </w:p>
         </w:tc>
@@ -1309,7 +1309,7 @@
               <w:rPr>
                 <w:sz w:val="21"/>
               </w:rPr>
-              <w:t>CreationDate</w:t>
+              <w:t>Score</w:t>
             </w:r>
           </w:p>
         </w:tc>
@@ -1327,7 +1327,7 @@
               <w:rPr>
                 <w:sz w:val="21"/>
               </w:rPr>
-              <w:t>Ngày giờ</w:t>
+              <w:t>Số nguyên</w:t>
             </w:r>
           </w:p>
         </w:tc>
@@ -1345,7 +1345,7 @@
               <w:rPr>
                 <w:sz w:val="21"/>
               </w:rPr>
-              <w:t>2021–2025</w:t>
+              <w:t>−8 đến 150</w:t>
             </w:r>
           </w:p>
         </w:tc>
@@ -1363,7 +1363,7 @@
               <w:rPr>
                 <w:sz w:val="21"/>
               </w:rPr>
-              <w:t>Thời điểm đăng câu hỏi (UTC).</w:t>
+              <w:t>Số phiếu bầu ròng.</w:t>
             </w:r>
           </w:p>
         </w:tc>
@@ -1401,7 +1401,7 @@
               <w:rPr>
                 <w:sz w:val="21"/>
               </w:rPr>
-              <w:t>Score</w:t>
+              <w:t>ViewCount</w:t>
             </w:r>
           </w:p>
         </w:tc>
@@ -1437,7 +1437,7 @@
               <w:rPr>
                 <w:sz w:val="21"/>
               </w:rPr>
-              <w:t>−8 đến 150</w:t>
+              <w:t>8–510.497</w:t>
             </w:r>
           </w:p>
         </w:tc>
@@ -1455,7 +1455,7 @@
               <w:rPr>
                 <w:sz w:val="21"/>
               </w:rPr>
-              <w:t>Số phiếu bầu ròng.</w:t>
+              <w:t>Số lượt xem tích lũy.</w:t>
             </w:r>
           </w:p>
         </w:tc>
@@ -1677,7 +1677,7 @@
               <w:rPr>
                 <w:sz w:val="21"/>
               </w:rPr>
-              <w:t>Tags</w:t>
+              <w:t>IsAnswered</w:t>
             </w:r>
           </w:p>
         </w:tc>
@@ -1695,7 +1695,7 @@
               <w:rPr>
                 <w:sz w:val="21"/>
               </w:rPr>
-              <w:t>Chuỗi</w:t>
+              <w:t>Logic</w:t>
             </w:r>
           </w:p>
         </w:tc>
@@ -1713,7 +1713,7 @@
               <w:rPr>
                 <w:sz w:val="21"/>
               </w:rPr>
-              <w:t>Nhiều tag</w:t>
+              <w:t>Đúng/sai</w:t>
             </w:r>
           </w:p>
         </w:tc>
@@ -1731,7 +1731,467 @@
               <w:rPr>
                 <w:sz w:val="21"/>
               </w:rPr>
+              <w:t>Cờ trạng thái trả lời từ API.</w:t>
+            </w:r>
+          </w:p>
+        </w:tc>
+      </w:tr>
+      <w:tr>
+        <w:tc>
+          <w:tcPr>
+            <w:tcW w:type="dxa" w:w="680"/>
+          </w:tcPr>
+          <w:p>
+            <w:pPr>
+              <w:spacing w:before="0" w:after="0" w:line="240" w:lineRule="auto"/>
+              <w:ind w:firstLine="0"/>
+              <w:jc w:val="left"/>
+            </w:pPr>
+            <w:r>
+              <w:rPr>
+                <w:sz w:val="21"/>
+              </w:rPr>
+              <w:t>9</w:t>
+            </w:r>
+          </w:p>
+        </w:tc>
+        <w:tc>
+          <w:tcPr>
+            <w:tcW w:type="dxa" w:w="2041"/>
+          </w:tcPr>
+          <w:p>
+            <w:pPr>
+              <w:spacing w:before="0" w:after="0" w:line="240" w:lineRule="auto"/>
+              <w:ind w:firstLine="0"/>
+              <w:jc w:val="left"/>
+            </w:pPr>
+            <w:r>
+              <w:rPr>
+                <w:sz w:val="21"/>
+              </w:rPr>
+              <w:t>ClosedDate</w:t>
+            </w:r>
+          </w:p>
+        </w:tc>
+        <w:tc>
+          <w:tcPr>
+            <w:tcW w:type="dxa" w:w="1417"/>
+          </w:tcPr>
+          <w:p>
+            <w:pPr>
+              <w:spacing w:before="0" w:after="0" w:line="240" w:lineRule="auto"/>
+              <w:ind w:firstLine="0"/>
+              <w:jc w:val="left"/>
+            </w:pPr>
+            <w:r>
+              <w:rPr>
+                <w:sz w:val="21"/>
+              </w:rPr>
+              <w:t>Ngày/khuyết</w:t>
+            </w:r>
+          </w:p>
+        </w:tc>
+        <w:tc>
+          <w:tcPr>
+            <w:tcW w:type="dxa" w:w="1587"/>
+          </w:tcPr>
+          <w:p>
+            <w:pPr>
+              <w:spacing w:before="0" w:after="0" w:line="240" w:lineRule="auto"/>
+              <w:ind w:firstLine="0"/>
+              <w:jc w:val="left"/>
+            </w:pPr>
+            <w:r>
+              <w:rPr>
+                <w:sz w:val="21"/>
+              </w:rPr>
+              <w:t>Có/không</w:t>
+            </w:r>
+          </w:p>
+        </w:tc>
+        <w:tc>
+          <w:tcPr>
+            <w:tcW w:type="dxa" w:w="3175"/>
+          </w:tcPr>
+          <w:p>
+            <w:pPr>
+              <w:spacing w:before="0" w:after="0" w:line="240" w:lineRule="auto"/>
+              <w:ind w:firstLine="0"/>
+              <w:jc w:val="left"/>
+            </w:pPr>
+            <w:r>
+              <w:rPr>
+                <w:sz w:val="21"/>
+              </w:rPr>
+              <w:t>Ngày đóng câu hỏi, nếu có.</w:t>
+            </w:r>
+          </w:p>
+        </w:tc>
+      </w:tr>
+      <w:tr>
+        <w:tc>
+          <w:tcPr>
+            <w:tcW w:type="dxa" w:w="680"/>
+          </w:tcPr>
+          <w:p>
+            <w:pPr>
+              <w:spacing w:before="0" w:after="0" w:line="240" w:lineRule="auto"/>
+              <w:ind w:firstLine="0"/>
+              <w:jc w:val="left"/>
+            </w:pPr>
+            <w:r>
+              <w:rPr>
+                <w:sz w:val="21"/>
+              </w:rPr>
+              <w:t>10</w:t>
+            </w:r>
+          </w:p>
+        </w:tc>
+        <w:tc>
+          <w:tcPr>
+            <w:tcW w:type="dxa" w:w="2041"/>
+          </w:tcPr>
+          <w:p>
+            <w:pPr>
+              <w:spacing w:before="0" w:after="0" w:line="240" w:lineRule="auto"/>
+              <w:ind w:firstLine="0"/>
+              <w:jc w:val="left"/>
+            </w:pPr>
+            <w:r>
+              <w:rPr>
+                <w:sz w:val="21"/>
+              </w:rPr>
+              <w:t>Tags</w:t>
+            </w:r>
+          </w:p>
+        </w:tc>
+        <w:tc>
+          <w:tcPr>
+            <w:tcW w:type="dxa" w:w="1417"/>
+          </w:tcPr>
+          <w:p>
+            <w:pPr>
+              <w:spacing w:before="0" w:after="0" w:line="240" w:lineRule="auto"/>
+              <w:ind w:firstLine="0"/>
+              <w:jc w:val="left"/>
+            </w:pPr>
+            <w:r>
+              <w:rPr>
+                <w:sz w:val="21"/>
+              </w:rPr>
+              <w:t>Chuỗi</w:t>
+            </w:r>
+          </w:p>
+        </w:tc>
+        <w:tc>
+          <w:tcPr>
+            <w:tcW w:type="dxa" w:w="1587"/>
+          </w:tcPr>
+          <w:p>
+            <w:pPr>
+              <w:spacing w:before="0" w:after="0" w:line="240" w:lineRule="auto"/>
+              <w:ind w:firstLine="0"/>
+              <w:jc w:val="left"/>
+            </w:pPr>
+            <w:r>
+              <w:rPr>
+                <w:sz w:val="21"/>
+              </w:rPr>
+              <w:t>Nhiều tag</w:t>
+            </w:r>
+          </w:p>
+        </w:tc>
+        <w:tc>
+          <w:tcPr>
+            <w:tcW w:type="dxa" w:w="3175"/>
+          </w:tcPr>
+          <w:p>
+            <w:pPr>
+              <w:spacing w:before="0" w:after="0" w:line="240" w:lineRule="auto"/>
+              <w:ind w:firstLine="0"/>
+              <w:jc w:val="left"/>
+            </w:pPr>
+            <w:r>
+              <w:rPr>
+                <w:sz w:val="21"/>
+              </w:rPr>
               <w:t>Tag gắn với câu hỏi.</w:t>
+            </w:r>
+          </w:p>
+        </w:tc>
+      </w:tr>
+      <w:tr>
+        <w:tc>
+          <w:tcPr>
+            <w:tcW w:type="dxa" w:w="680"/>
+          </w:tcPr>
+          <w:p>
+            <w:pPr>
+              <w:spacing w:before="0" w:after="0" w:line="240" w:lineRule="auto"/>
+              <w:ind w:firstLine="0"/>
+              <w:jc w:val="left"/>
+            </w:pPr>
+            <w:r>
+              <w:rPr>
+                <w:sz w:val="21"/>
+              </w:rPr>
+              <w:t>11</w:t>
+            </w:r>
+          </w:p>
+        </w:tc>
+        <w:tc>
+          <w:tcPr>
+            <w:tcW w:type="dxa" w:w="2041"/>
+          </w:tcPr>
+          <w:p>
+            <w:pPr>
+              <w:spacing w:before="0" w:after="0" w:line="240" w:lineRule="auto"/>
+              <w:ind w:firstLine="0"/>
+              <w:jc w:val="left"/>
+            </w:pPr>
+            <w:r>
+              <w:rPr>
+                <w:sz w:val="21"/>
+              </w:rPr>
+              <w:t>Month</w:t>
+            </w:r>
+          </w:p>
+        </w:tc>
+        <w:tc>
+          <w:tcPr>
+            <w:tcW w:type="dxa" w:w="1417"/>
+          </w:tcPr>
+          <w:p>
+            <w:pPr>
+              <w:spacing w:before="0" w:after="0" w:line="240" w:lineRule="auto"/>
+              <w:ind w:firstLine="0"/>
+              <w:jc w:val="left"/>
+            </w:pPr>
+            <w:r>
+              <w:rPr>
+                <w:sz w:val="21"/>
+              </w:rPr>
+              <w:t>Chuỗi</w:t>
+            </w:r>
+          </w:p>
+        </w:tc>
+        <w:tc>
+          <w:tcPr>
+            <w:tcW w:type="dxa" w:w="1587"/>
+          </w:tcPr>
+          <w:p>
+            <w:pPr>
+              <w:spacing w:before="0" w:after="0" w:line="240" w:lineRule="auto"/>
+              <w:ind w:firstLine="0"/>
+              <w:jc w:val="left"/>
+            </w:pPr>
+            <w:r>
+              <w:rPr>
+                <w:sz w:val="21"/>
+              </w:rPr>
+              <w:t>2021-01–2025-12</w:t>
+            </w:r>
+          </w:p>
+        </w:tc>
+        <w:tc>
+          <w:tcPr>
+            <w:tcW w:type="dxa" w:w="3175"/>
+          </w:tcPr>
+          <w:p>
+            <w:pPr>
+              <w:spacing w:before="0" w:after="0" w:line="240" w:lineRule="auto"/>
+              <w:ind w:firstLine="0"/>
+              <w:jc w:val="left"/>
+            </w:pPr>
+            <w:r>
+              <w:rPr>
+                <w:sz w:val="21"/>
+              </w:rPr>
+              <w:t>Tháng trích từ CreationDate (*).</w:t>
+            </w:r>
+          </w:p>
+        </w:tc>
+      </w:tr>
+      <w:tr>
+        <w:tc>
+          <w:tcPr>
+            <w:tcW w:type="dxa" w:w="680"/>
+          </w:tcPr>
+          <w:p>
+            <w:pPr>
+              <w:spacing w:before="0" w:after="0" w:line="240" w:lineRule="auto"/>
+              <w:ind w:firstLine="0"/>
+              <w:jc w:val="left"/>
+            </w:pPr>
+            <w:r>
+              <w:rPr>
+                <w:sz w:val="21"/>
+              </w:rPr>
+              <w:t>12</w:t>
+            </w:r>
+          </w:p>
+        </w:tc>
+        <w:tc>
+          <w:tcPr>
+            <w:tcW w:type="dxa" w:w="2041"/>
+          </w:tcPr>
+          <w:p>
+            <w:pPr>
+              <w:spacing w:before="0" w:after="0" w:line="240" w:lineRule="auto"/>
+              <w:ind w:firstLine="0"/>
+              <w:jc w:val="left"/>
+            </w:pPr>
+            <w:r>
+              <w:rPr>
+                <w:sz w:val="21"/>
+              </w:rPr>
+              <w:t>Period</w:t>
+            </w:r>
+          </w:p>
+        </w:tc>
+        <w:tc>
+          <w:tcPr>
+            <w:tcW w:type="dxa" w:w="1417"/>
+          </w:tcPr>
+          <w:p>
+            <w:pPr>
+              <w:spacing w:before="0" w:after="0" w:line="240" w:lineRule="auto"/>
+              <w:ind w:firstLine="0"/>
+              <w:jc w:val="left"/>
+            </w:pPr>
+            <w:r>
+              <w:rPr>
+                <w:sz w:val="21"/>
+              </w:rPr>
+              <w:t>Chuỗi</w:t>
+            </w:r>
+          </w:p>
+        </w:tc>
+        <w:tc>
+          <w:tcPr>
+            <w:tcW w:type="dxa" w:w="1587"/>
+          </w:tcPr>
+          <w:p>
+            <w:pPr>
+              <w:spacing w:before="0" w:after="0" w:line="240" w:lineRule="auto"/>
+              <w:ind w:firstLine="0"/>
+              <w:jc w:val="left"/>
+            </w:pPr>
+            <w:r>
+              <w:rPr>
+                <w:sz w:val="21"/>
+              </w:rPr>
+              <w:t>Before/After</w:t>
+            </w:r>
+          </w:p>
+        </w:tc>
+        <w:tc>
+          <w:tcPr>
+            <w:tcW w:type="dxa" w:w="3175"/>
+          </w:tcPr>
+          <w:p>
+            <w:pPr>
+              <w:spacing w:before="0" w:after="0" w:line="240" w:lineRule="auto"/>
+              <w:ind w:firstLine="0"/>
+              <w:jc w:val="left"/>
+            </w:pPr>
+            <w:r>
+              <w:rPr>
+                <w:sz w:val="21"/>
+              </w:rPr>
+              <w:t>Giai đoạn theo mốc 12/2022 (*).</w:t>
+            </w:r>
+          </w:p>
+        </w:tc>
+      </w:tr>
+      <w:tr>
+        <w:tc>
+          <w:tcPr>
+            <w:tcW w:type="dxa" w:w="680"/>
+          </w:tcPr>
+          <w:p>
+            <w:pPr>
+              <w:spacing w:before="0" w:after="0" w:line="240" w:lineRule="auto"/>
+              <w:ind w:firstLine="0"/>
+              <w:jc w:val="left"/>
+            </w:pPr>
+            <w:r>
+              <w:rPr>
+                <w:sz w:val="21"/>
+              </w:rPr>
+              <w:t>13</w:t>
+            </w:r>
+          </w:p>
+        </w:tc>
+        <w:tc>
+          <w:tcPr>
+            <w:tcW w:type="dxa" w:w="2041"/>
+          </w:tcPr>
+          <w:p>
+            <w:pPr>
+              <w:spacing w:before="0" w:after="0" w:line="240" w:lineRule="auto"/>
+              <w:ind w:firstLine="0"/>
+              <w:jc w:val="left"/>
+            </w:pPr>
+            <w:r>
+              <w:rPr>
+                <w:sz w:val="21"/>
+              </w:rPr>
+              <w:t>HasAccepted</w:t>
+            </w:r>
+          </w:p>
+        </w:tc>
+        <w:tc>
+          <w:tcPr>
+            <w:tcW w:type="dxa" w:w="1417"/>
+          </w:tcPr>
+          <w:p>
+            <w:pPr>
+              <w:spacing w:before="0" w:after="0" w:line="240" w:lineRule="auto"/>
+              <w:ind w:firstLine="0"/>
+              <w:jc w:val="left"/>
+            </w:pPr>
+            <w:r>
+              <w:rPr>
+                <w:sz w:val="21"/>
+              </w:rPr>
+              <w:t>Logic</w:t>
+            </w:r>
+          </w:p>
+        </w:tc>
+        <w:tc>
+          <w:tcPr>
+            <w:tcW w:type="dxa" w:w="1587"/>
+          </w:tcPr>
+          <w:p>
+            <w:pPr>
+              <w:spacing w:before="0" w:after="0" w:line="240" w:lineRule="auto"/>
+              <w:ind w:firstLine="0"/>
+              <w:jc w:val="left"/>
+            </w:pPr>
+            <w:r>
+              <w:rPr>
+                <w:sz w:val="21"/>
+              </w:rPr>
+              <w:t>Đúng/sai</w:t>
+            </w:r>
+          </w:p>
+        </w:tc>
+        <w:tc>
+          <w:tcPr>
+            <w:tcW w:type="dxa" w:w="3175"/>
+          </w:tcPr>
+          <w:p>
+            <w:pPr>
+              <w:spacing w:before="0" w:after="0" w:line="240" w:lineRule="auto"/>
+              <w:ind w:firstLine="0"/>
+              <w:jc w:val="left"/>
+            </w:pPr>
+            <w:r>
+              <w:rPr>
+                <w:sz w:val="21"/>
+              </w:rPr>
+              <w:t>AcceptedAnswerId có giá trị (*).</w:t>
             </w:r>
           </w:p>
         </w:tc>
@@ -1747,7 +2207,7 @@
         <w:rPr>
           <w:i/>
         </w:rPr>
-        <w:t>Bảng 1. Các trường dữ liệu chính sử dụng trong phân tích</w:t>
+        <w:t>Bảng 1. Mười ba cột của bảng câu hỏi mẫu; (*) là cột tính thêm</w:t>
       </w:r>
     </w:p>
     <w:p>
@@ -1755,7 +2215,7 @@
         <w:pStyle w:val="BT"/>
       </w:pPr>
       <w:r>
-        <w:t>Kiểm tra ban đầu cho thấy 6.000 câu hỏi mẫu đều có PostTypeId = 1, không trùng Id và không thiếu CreationDate, Score, AnswerCount hay Tags. Có 3.695 giá trị AcceptedAnswerId trống (61,6%); đây được hiểu là chưa có câu trả lời được người hỏi chấp nhận, nên không loại các dòng này. Các bước lọc theo loại bài, thời gian, trùng lặp, trường thiết yếu và tag đều loại 0 dòng.</w:t>
+        <w:t>Kiểm tra ban đầu cho thấy 6.000 câu hỏi mẫu đều có PostTypeId = 1, không trùng Id và không thiếu CreationDate, Score, AnswerCount hay Tags. Có 3.695 giá trị AcceptedAnswerId trống (61,6%) và 5.674 giá trị ClosedDate trống; hai trường này có thể khuyết theo trạng thái câu hỏi nên không loại các dòng đó. Month được trích từ CreationDate; Period chia trước/sau tháng 12/2022; HasAccepted cho biết AcceptedAnswerId có giá trị. Các bước lọc theo loại bài, thời gian, trùng lặp, trường thiết yếu và tag đều loại 0 dòng.</w:t>
       </w:r>
     </w:p>
     <w:p>

</xml_diff>

<commit_message>
Restore report footer names and page layout
</commit_message>
<xml_diff>
--- a/Nhom6_Bao_cao.docx
+++ b/Nhom6_Bao_cao.docx
@@ -3099,7 +3099,7 @@
         <w:i/>
         <w:lang w:val="vi-VN"/>
       </w:rPr>
-      <w:t/>
+      <w:t>Đặng V. Hậu – Huỳnh Đ. Long – Trần N.G. Huy</w:t>
     </w:r>
     <w:r>
       <w:tab/>
@@ -3222,7 +3222,7 @@
         <w:i/>
         <w:lang w:val="vi-VN"/>
       </w:rPr>
-      <w:t/>
+      <w:t>Đặng V. Hậu – Huỳnh Đ. Long – Trần N.G. Huy</w:t>
     </w:r>
     <w:r>
       <w:tab/>

</xml_diff>

<commit_message>
Use full member names in report footer
</commit_message>
<xml_diff>
--- a/Nhom6_Bao_cao.docx
+++ b/Nhom6_Bao_cao.docx
@@ -3099,7 +3099,7 @@
         <w:i/>
         <w:lang w:val="vi-VN"/>
       </w:rPr>
-      <w:t>Đặng V. Hậu – Huỳnh Đ. Long – Trần N.G. Huy</w:t>
+      <w:t>Đặng Văn Hậu – Huỳnh Đại Long – Trần Nguyễn Gia Huy</w:t>
     </w:r>
     <w:r>
       <w:tab/>
@@ -3222,7 +3222,7 @@
         <w:i/>
         <w:lang w:val="vi-VN"/>
       </w:rPr>
-      <w:t>Đặng V. Hậu – Huỳnh Đ. Long – Trần N.G. Huy</w:t>
+      <w:t>Đặng Văn Hậu – Huỳnh Đại Long – Trần Nguyễn Gia Huy</w:t>
     </w:r>
     <w:r>
       <w:tab/>

</xml_diff>

<commit_message>
Expand IE313 report analysis to seven pages
</commit_message>
<xml_diff>
--- a/Nhom6_Bao_cao.docx
+++ b/Nhom6_Bao_cao.docx
@@ -3364,6 +3364,14 @@
         <w:t>.</w:t>
       </w:r>
     </w:p>
+    <w:p>
+      <w:pPr>
+        <w:pStyle w:val="BT"/>
+      </w:pPr>
+      <w:r>
+        <w:t>Ba bảng có đơn vị quan sát khác nhau. Bảng tổng theo tháng phản ánh toàn bộ số bài đăng trong khoảng thời gian khảo sát; bảng câu hỏi mẫu chỉ cung cấp thuộc tính của 100 câu hỏi được lấy ở mỗi tháng; bảng tag đếm câu hỏi mang từng nhãn đã chọn. Vì vậy, các tỷ lệ về Score, câu trả lời được chấp nhận hoặc số câu trả lời mà một câu hỏi nhận được phải tính từ mẫu và được trình bày như ước lượng. Không thể lấy 6.000 dòng mẫu làm mẫu số cho số đếm của toàn trang.</w:t>
+      </w:r>
+    </w:p>
     <w:tbl>
       <w:tblPr>
         <w:tblStyle w:val="new"/>
@@ -7447,6 +7455,14 @@
       <w:proofErr w:type="spellEnd"/>
       <w:r>
         <w:t>.</w:t>
+      </w:r>
+    </w:p>
+    <w:p>
+      <w:pPr>
+        <w:pStyle w:val="BT"/>
+      </w:pPr>
+      <w:r>
+        <w:t>Trọng số giúp các tháng có quy mô đăng bài khác nhau đóng góp tương ứng vào ước lượng của cả giai đoạn. Chẳng hạn, tháng 01/2021 có 139.827 câu hỏi trên toàn trang nhưng chỉ 100 câu hỏi trong mẫu; mỗi câu hỏi mẫu của tháng này mang trọng số 1.398,27. Nếu tính trung bình trực tiếp trên 2.300 và 3.700 dòng mẫu, các tháng cuối giai đoạn có ít câu hỏi vẫn được coi ngang với các tháng đầu có nhiều câu hỏi. Trọng số sửa sự mất cân đối theo tháng, nhưng không loại được thiên lệch có thể phát sinh do 100 câu hỏi nằm gần nhau về thời điểm đăng.</w:t>
       </w:r>
     </w:p>
     <w:p>
@@ -8668,6 +8684,14 @@
     </w:p>
     <w:p>
       <w:pPr>
+        <w:pStyle w:val="BT"/>
+      </w:pPr>
+      <w:r>
+        <w:t>Khi đọc kết quả, nhóm tách ba mức độ chắc chắn. Số Questions và Answers theo tháng là số đếm API trong phạm vi truy vấn; số đếm của tag chỉ áp dụng cho tập tag được chọn; các thước đo ở cấp câu hỏi là ước lượng từ mẫu. Biên sai số tính trong notebook chỉ mô tả sai số lấy mẫu theo giả định thống kê đã dùng. Do cách lấy mẫu theo cụm thời gian và sự khác nhau về tuổi bài đăng, biên này không bao quát hết các nguồn sai lệch có thể có.</w:t>
+      </w:r>
+    </w:p>
+    <w:p>
+      <w:pPr>
         <w:pStyle w:val="Heading1"/>
       </w:pPr>
       <w:r>
@@ -9742,6 +9766,1036 @@
       <w:proofErr w:type="spellEnd"/>
       <w:r>
         <w:t>.</w:t>
+      </w:r>
+    </w:p>
+    <w:p>
+      <w:pPr>
+        <w:pStyle w:val="BT"/>
+      </w:pPr>
+      <w:r>
+        <w:t>Xét theo năm, số câu hỏi giảm từ 1.534.282 năm 2021 xuống 109.759 năm 2025, tương đương mức giảm 92,8%. Số câu trả lời cùng kỳ giảm từ 1.986.284 xuống 188.478. Bảng 2 trình bày cả tổng số và mức bình quân tháng để thấy quy mô thay đổi trong từng năm, không chỉ chênh lệch giữa hai giai đoạn lớn.</w:t>
+      </w:r>
+    </w:p>
+    <w:p>
+      <w:pPr>
+        <w:pStyle w:val="BT"/>
+        <w:jc w:val="center"/>
+      </w:pPr>
+      <w:r>
+        <w:rPr>
+          <w:i/>
+        </w:rPr>
+        <w:t>Bảng 2. Số câu hỏi và câu trả lời theo năm</w:t>
+      </w:r>
+    </w:p>
+    <w:tbl>
+      <w:tblPr>
+        <w:tblStyle w:val="new"/>
+        <w:tblW w:w="0" w:type="auto"/>
+        <w:tblLayout w:type="fixed"/>
+        <w:tblLook w:val="04A0" w:firstRow="1" w:lastRow="0" w:firstColumn="1" w:lastColumn="0" w:noHBand="0" w:noVBand="1"/>
+      </w:tblPr>
+      <w:tblGrid>
+        <w:gridCol w:w="680"/>
+        <w:gridCol w:w="2041"/>
+        <w:gridCol w:w="1417"/>
+        <w:gridCol w:w="1587"/>
+        <w:gridCol w:w="3175"/>
+      </w:tblGrid>
+      <w:tr>
+        <w:trPr>
+          <w:cnfStyle w:val="100000000000" w:firstRow="1" w:lastRow="0" w:firstColumn="0" w:lastColumn="0" w:oddVBand="0" w:evenVBand="0" w:oddHBand="0" w:evenHBand="0" w:firstRowFirstColumn="0" w:firstRowLastColumn="0" w:lastRowFirstColumn="0" w:lastRowLastColumn="0"/>
+          <w:tblHeader/>
+        </w:trPr>
+        <w:tc>
+          <w:tcPr>
+            <w:tcW w:w="680" w:type="dxa"/>
+          </w:tcPr>
+          <w:p>
+            <w:pPr>
+              <w:spacing w:after="0" w:line="240" w:lineRule="auto"/>
+              <w:jc w:val="left"/>
+            </w:pPr>
+            <w:r>
+              <w:rPr>
+                <w:color w:val="FF0000"/>
+                <w:sz w:val="21"/>
+              </w:rPr>
+              <w:t>Năm</w:t>
+            </w:r>
+          </w:p>
+        </w:tc>
+        <w:tc>
+          <w:tcPr>
+            <w:tcW w:w="2041" w:type="dxa"/>
+          </w:tcPr>
+          <w:p>
+            <w:pPr>
+              <w:spacing w:after="0" w:line="240" w:lineRule="auto"/>
+              <w:jc w:val="left"/>
+            </w:pPr>
+            <w:proofErr w:type="spellStart"/>
+            <w:r>
+              <w:rPr>
+                <w:color w:val="FF0000"/>
+                <w:sz w:val="21"/>
+              </w:rPr>
+              <w:t>Câu hỏi</w:t>
+            </w:r>
+            <w:proofErr w:type="spellEnd"/>
+            <w:r>
+              <w:rPr>
+                <w:color w:val="FF0000"/>
+                <w:sz w:val="21"/>
+              </w:rPr>
+              <w:t xml:space="preserve"/>
+            </w:r>
+            <w:proofErr w:type="spellStart"/>
+            <w:r>
+              <w:rPr>
+                <w:color w:val="FF0000"/>
+                <w:sz w:val="21"/>
+              </w:rPr>
+              <w:t/>
+            </w:r>
+            <w:proofErr w:type="spellEnd"/>
+          </w:p>
+        </w:tc>
+        <w:tc>
+          <w:tcPr>
+            <w:tcW w:w="1417" w:type="dxa"/>
+          </w:tcPr>
+          <w:p>
+            <w:pPr>
+              <w:spacing w:after="0" w:line="240" w:lineRule="auto"/>
+              <w:jc w:val="left"/>
+            </w:pPr>
+            <w:proofErr w:type="spellStart"/>
+            <w:r>
+              <w:rPr>
+                <w:color w:val="FF0000"/>
+                <w:sz w:val="21"/>
+              </w:rPr>
+              <w:t>Câu trả lời</w:t>
+            </w:r>
+            <w:proofErr w:type="spellEnd"/>
+            <w:r>
+              <w:rPr>
+                <w:color w:val="FF0000"/>
+                <w:sz w:val="21"/>
+              </w:rPr>
+              <w:t xml:space="preserve"/>
+            </w:r>
+            <w:proofErr w:type="spellStart"/>
+            <w:r>
+              <w:rPr>
+                <w:color w:val="FF0000"/>
+                <w:sz w:val="21"/>
+              </w:rPr>
+              <w:t/>
+            </w:r>
+            <w:proofErr w:type="spellEnd"/>
+            <w:r>
+              <w:rPr>
+                <w:color w:val="FF0000"/>
+                <w:sz w:val="21"/>
+              </w:rPr>
+              <w:t xml:space="preserve"/>
+            </w:r>
+            <w:proofErr w:type="spellStart"/>
+            <w:r>
+              <w:rPr>
+                <w:color w:val="FF0000"/>
+                <w:sz w:val="21"/>
+              </w:rPr>
+              <w:t/>
+            </w:r>
+            <w:proofErr w:type="spellEnd"/>
+          </w:p>
+        </w:tc>
+        <w:tc>
+          <w:tcPr>
+            <w:tcW w:w="1587" w:type="dxa"/>
+          </w:tcPr>
+          <w:p>
+            <w:pPr>
+              <w:spacing w:after="0" w:line="240" w:lineRule="auto"/>
+              <w:jc w:val="left"/>
+            </w:pPr>
+            <w:r>
+              <w:rPr>
+                <w:color w:val="FF0000"/>
+                <w:sz w:val="21"/>
+              </w:rPr>
+              <w:t>TB hỏi/tháng</w:t>
+            </w:r>
+          </w:p>
+        </w:tc>
+        <w:tc>
+          <w:tcPr>
+            <w:tcW w:w="3175" w:type="dxa"/>
+          </w:tcPr>
+          <w:p>
+            <w:pPr>
+              <w:spacing w:after="0" w:line="240" w:lineRule="auto"/>
+              <w:jc w:val="left"/>
+            </w:pPr>
+            <w:proofErr w:type="spellStart"/>
+            <w:r>
+              <w:rPr>
+                <w:color w:val="FF0000"/>
+                <w:sz w:val="21"/>
+              </w:rPr>
+              <w:t>TB đáp/tháng</w:t>
+            </w:r>
+            <w:proofErr w:type="spellEnd"/>
+            <w:r>
+              <w:rPr>
+                <w:color w:val="FF0000"/>
+                <w:sz w:val="21"/>
+              </w:rPr>
+              <w:t xml:space="preserve"/>
+            </w:r>
+            <w:proofErr w:type="spellStart"/>
+            <w:r>
+              <w:rPr>
+                <w:color w:val="FF0000"/>
+                <w:sz w:val="21"/>
+              </w:rPr>
+              <w:t/>
+            </w:r>
+            <w:proofErr w:type="spellEnd"/>
+          </w:p>
+        </w:tc>
+      </w:tr>
+      <w:tr>
+        <w:tc>
+          <w:tcPr>
+            <w:tcW w:w="680" w:type="dxa"/>
+          </w:tcPr>
+          <w:p>
+            <w:pPr>
+              <w:spacing w:after="0" w:line="240" w:lineRule="auto"/>
+              <w:jc w:val="left"/>
+            </w:pPr>
+            <w:r>
+              <w:rPr>
+                <w:sz w:val="21"/>
+              </w:rPr>
+              <w:t>2021</w:t>
+            </w:r>
+          </w:p>
+        </w:tc>
+        <w:tc>
+          <w:tcPr>
+            <w:tcW w:w="2041" w:type="dxa"/>
+          </w:tcPr>
+          <w:p>
+            <w:pPr>
+              <w:spacing w:after="0" w:line="240" w:lineRule="auto"/>
+              <w:jc w:val="left"/>
+            </w:pPr>
+            <w:r>
+              <w:rPr>
+                <w:sz w:val="21"/>
+              </w:rPr>
+              <w:t>1.534.282</w:t>
+            </w:r>
+          </w:p>
+        </w:tc>
+        <w:tc>
+          <w:tcPr>
+            <w:tcW w:w="1417" w:type="dxa"/>
+          </w:tcPr>
+          <w:p>
+            <w:pPr>
+              <w:spacing w:after="0" w:line="240" w:lineRule="auto"/>
+              <w:jc w:val="left"/>
+            </w:pPr>
+            <w:proofErr w:type="spellStart"/>
+            <w:r>
+              <w:rPr>
+                <w:sz w:val="21"/>
+              </w:rPr>
+              <w:t>1.986.284</w:t>
+            </w:r>
+            <w:proofErr w:type="spellEnd"/>
+            <w:r>
+              <w:rPr>
+                <w:sz w:val="21"/>
+              </w:rPr>
+              <w:t xml:space="preserve"/>
+            </w:r>
+            <w:proofErr w:type="spellStart"/>
+            <w:r>
+              <w:rPr>
+                <w:sz w:val="21"/>
+              </w:rPr>
+              <w:t/>
+            </w:r>
+            <w:proofErr w:type="spellEnd"/>
+          </w:p>
+        </w:tc>
+        <w:tc>
+          <w:tcPr>
+            <w:tcW w:w="1587" w:type="dxa"/>
+          </w:tcPr>
+          <w:p>
+            <w:pPr>
+              <w:spacing w:after="0" w:line="240" w:lineRule="auto"/>
+              <w:jc w:val="left"/>
+            </w:pPr>
+            <w:r>
+              <w:rPr>
+                <w:sz w:val="21"/>
+              </w:rPr>
+              <w:t xml:space="preserve">127.857</w:t>
+            </w:r>
+            <w:proofErr w:type="spellStart"/>
+            <w:r>
+              <w:rPr>
+                <w:sz w:val="21"/>
+              </w:rPr>
+              <w:t/>
+            </w:r>
+            <w:proofErr w:type="spellEnd"/>
+          </w:p>
+        </w:tc>
+        <w:tc>
+          <w:tcPr>
+            <w:tcW w:w="3175" w:type="dxa"/>
+          </w:tcPr>
+          <w:p>
+            <w:pPr>
+              <w:spacing w:after="0" w:line="240" w:lineRule="auto"/>
+              <w:jc w:val="left"/>
+            </w:pPr>
+            <w:proofErr w:type="spellStart"/>
+            <w:r>
+              <w:rPr>
+                <w:sz w:val="21"/>
+              </w:rPr>
+              <w:t>165.524</w:t>
+            </w:r>
+            <w:proofErr w:type="spellEnd"/>
+            <w:r>
+              <w:rPr>
+                <w:sz w:val="21"/>
+              </w:rPr>
+              <w:t xml:space="preserve"/>
+            </w:r>
+            <w:proofErr w:type="spellStart"/>
+            <w:r>
+              <w:rPr>
+                <w:sz w:val="21"/>
+              </w:rPr>
+              <w:t/>
+            </w:r>
+            <w:proofErr w:type="spellEnd"/>
+            <w:r>
+              <w:rPr>
+                <w:sz w:val="21"/>
+              </w:rPr>
+              <w:t xml:space="preserve"/>
+            </w:r>
+            <w:proofErr w:type="spellStart"/>
+            <w:r>
+              <w:rPr>
+                <w:sz w:val="21"/>
+              </w:rPr>
+              <w:t/>
+            </w:r>
+            <w:proofErr w:type="spellEnd"/>
+            <w:r>
+              <w:rPr>
+                <w:sz w:val="21"/>
+              </w:rPr>
+              <w:t xml:space="preserve"/>
+            </w:r>
+            <w:proofErr w:type="spellStart"/>
+            <w:r>
+              <w:rPr>
+                <w:sz w:val="21"/>
+              </w:rPr>
+              <w:t/>
+            </w:r>
+            <w:proofErr w:type="spellEnd"/>
+            <w:r>
+              <w:rPr>
+                <w:sz w:val="21"/>
+              </w:rPr>
+              <w:t xml:space="preserve"/>
+            </w:r>
+          </w:p>
+        </w:tc>
+      </w:tr>
+      <w:tr>
+        <w:tc>
+          <w:tcPr>
+            <w:tcW w:w="680" w:type="dxa"/>
+          </w:tcPr>
+          <w:p>
+            <w:pPr>
+              <w:spacing w:after="0" w:line="240" w:lineRule="auto"/>
+              <w:jc w:val="left"/>
+            </w:pPr>
+            <w:r>
+              <w:rPr>
+                <w:sz w:val="21"/>
+              </w:rPr>
+              <w:t>2022</w:t>
+            </w:r>
+          </w:p>
+        </w:tc>
+        <w:tc>
+          <w:tcPr>
+            <w:tcW w:w="2041" w:type="dxa"/>
+          </w:tcPr>
+          <w:p>
+            <w:pPr>
+              <w:spacing w:after="0" w:line="240" w:lineRule="auto"/>
+              <w:jc w:val="left"/>
+            </w:pPr>
+            <w:proofErr w:type="spellStart"/>
+            <w:r>
+              <w:rPr>
+                <w:sz w:val="21"/>
+              </w:rPr>
+              <w:t>1.335.301</w:t>
+            </w:r>
+            <w:proofErr w:type="spellEnd"/>
+          </w:p>
+        </w:tc>
+        <w:tc>
+          <w:tcPr>
+            <w:tcW w:w="1417" w:type="dxa"/>
+          </w:tcPr>
+          <w:p>
+            <w:pPr>
+              <w:spacing w:after="0" w:line="240" w:lineRule="auto"/>
+              <w:jc w:val="left"/>
+            </w:pPr>
+            <w:proofErr w:type="spellStart"/>
+            <w:r>
+              <w:rPr>
+                <w:sz w:val="21"/>
+              </w:rPr>
+              <w:t>1.718.090</w:t>
+            </w:r>
+            <w:proofErr w:type="spellEnd"/>
+            <w:r>
+              <w:rPr>
+                <w:sz w:val="21"/>
+              </w:rPr>
+              <w:t xml:space="preserve"/>
+            </w:r>
+            <w:proofErr w:type="spellStart"/>
+            <w:r>
+              <w:rPr>
+                <w:sz w:val="21"/>
+              </w:rPr>
+              <w:t/>
+            </w:r>
+            <w:proofErr w:type="spellEnd"/>
+          </w:p>
+        </w:tc>
+        <w:tc>
+          <w:tcPr>
+            <w:tcW w:w="1587" w:type="dxa"/>
+          </w:tcPr>
+          <w:p>
+            <w:pPr>
+              <w:spacing w:after="0" w:line="240" w:lineRule="auto"/>
+              <w:jc w:val="left"/>
+            </w:pPr>
+            <w:r>
+              <w:rPr>
+                <w:sz w:val="21"/>
+              </w:rPr>
+              <w:t>111.275</w:t>
+            </w:r>
+          </w:p>
+        </w:tc>
+        <w:tc>
+          <w:tcPr>
+            <w:tcW w:w="3175" w:type="dxa"/>
+          </w:tcPr>
+          <w:p>
+            <w:pPr>
+              <w:spacing w:after="0" w:line="240" w:lineRule="auto"/>
+              <w:jc w:val="left"/>
+            </w:pPr>
+            <w:proofErr w:type="spellStart"/>
+            <w:r>
+              <w:rPr>
+                <w:sz w:val="21"/>
+              </w:rPr>
+              <w:t>143.174</w:t>
+            </w:r>
+            <w:proofErr w:type="spellEnd"/>
+            <w:r>
+              <w:rPr>
+                <w:sz w:val="21"/>
+              </w:rPr>
+              <w:t xml:space="preserve"/>
+            </w:r>
+            <w:proofErr w:type="spellStart"/>
+            <w:r>
+              <w:rPr>
+                <w:sz w:val="21"/>
+              </w:rPr>
+              <w:t/>
+            </w:r>
+            <w:proofErr w:type="spellEnd"/>
+            <w:r>
+              <w:rPr>
+                <w:sz w:val="21"/>
+              </w:rPr>
+              <w:t xml:space="preserve"/>
+            </w:r>
+            <w:proofErr w:type="spellStart"/>
+            <w:r>
+              <w:rPr>
+                <w:sz w:val="21"/>
+              </w:rPr>
+              <w:t/>
+            </w:r>
+            <w:proofErr w:type="spellEnd"/>
+            <w:r>
+              <w:rPr>
+                <w:sz w:val="21"/>
+              </w:rPr>
+              <w:t xml:space="preserve"/>
+            </w:r>
+            <w:proofErr w:type="spellStart"/>
+            <w:r>
+              <w:rPr>
+                <w:sz w:val="21"/>
+              </w:rPr>
+              <w:t/>
+            </w:r>
+            <w:proofErr w:type="spellEnd"/>
+            <w:r>
+              <w:rPr>
+                <w:sz w:val="21"/>
+              </w:rPr>
+              <w:t/>
+            </w:r>
+          </w:p>
+        </w:tc>
+      </w:tr>
+      <w:tr>
+        <w:tc>
+          <w:tcPr>
+            <w:tcW w:w="680" w:type="dxa"/>
+          </w:tcPr>
+          <w:p>
+            <w:pPr>
+              <w:spacing w:after="0" w:line="240" w:lineRule="auto"/>
+              <w:jc w:val="left"/>
+            </w:pPr>
+            <w:r>
+              <w:rPr>
+                <w:sz w:val="21"/>
+              </w:rPr>
+              <w:t>2023</w:t>
+            </w:r>
+          </w:p>
+        </w:tc>
+        <w:tc>
+          <w:tcPr>
+            <w:tcW w:w="2041" w:type="dxa"/>
+          </w:tcPr>
+          <w:p>
+            <w:pPr>
+              <w:spacing w:after="0" w:line="240" w:lineRule="auto"/>
+              <w:jc w:val="left"/>
+            </w:pPr>
+            <w:proofErr w:type="spellStart"/>
+            <w:r>
+              <w:rPr>
+                <w:sz w:val="21"/>
+              </w:rPr>
+              <w:t>787.773</w:t>
+            </w:r>
+            <w:proofErr w:type="spellEnd"/>
+          </w:p>
+        </w:tc>
+        <w:tc>
+          <w:tcPr>
+            <w:tcW w:w="1417" w:type="dxa"/>
+          </w:tcPr>
+          <w:p>
+            <w:pPr>
+              <w:spacing w:after="0" w:line="240" w:lineRule="auto"/>
+              <w:jc w:val="left"/>
+            </w:pPr>
+            <w:proofErr w:type="spellStart"/>
+            <w:r>
+              <w:rPr>
+                <w:sz w:val="21"/>
+              </w:rPr>
+              <w:t>1.026.295</w:t>
+            </w:r>
+            <w:proofErr w:type="spellEnd"/>
+            <w:r>
+              <w:rPr>
+                <w:sz w:val="21"/>
+              </w:rPr>
+              <w:t xml:space="preserve"/>
+            </w:r>
+            <w:proofErr w:type="spellStart"/>
+            <w:r>
+              <w:rPr>
+                <w:sz w:val="21"/>
+              </w:rPr>
+              <w:t/>
+            </w:r>
+            <w:proofErr w:type="spellEnd"/>
+          </w:p>
+        </w:tc>
+        <w:tc>
+          <w:tcPr>
+            <w:tcW w:w="1587" w:type="dxa"/>
+          </w:tcPr>
+          <w:p>
+            <w:pPr>
+              <w:spacing w:after="0" w:line="240" w:lineRule="auto"/>
+              <w:jc w:val="left"/>
+            </w:pPr>
+            <w:r>
+              <w:rPr>
+                <w:sz w:val="21"/>
+              </w:rPr>
+              <w:t>65.648</w:t>
+            </w:r>
+          </w:p>
+        </w:tc>
+        <w:tc>
+          <w:tcPr>
+            <w:tcW w:w="3175" w:type="dxa"/>
+          </w:tcPr>
+          <w:p>
+            <w:pPr>
+              <w:spacing w:after="0" w:line="240" w:lineRule="auto"/>
+              <w:jc w:val="left"/>
+            </w:pPr>
+            <w:proofErr w:type="spellStart"/>
+            <w:r>
+              <w:rPr>
+                <w:sz w:val="21"/>
+              </w:rPr>
+              <w:t>85.525</w:t>
+            </w:r>
+            <w:proofErr w:type="spellEnd"/>
+            <w:r>
+              <w:rPr>
+                <w:sz w:val="21"/>
+              </w:rPr>
+              <w:t xml:space="preserve"/>
+            </w:r>
+            <w:proofErr w:type="spellStart"/>
+            <w:r>
+              <w:rPr>
+                <w:sz w:val="21"/>
+              </w:rPr>
+              <w:t/>
+            </w:r>
+            <w:proofErr w:type="spellEnd"/>
+            <w:r>
+              <w:rPr>
+                <w:sz w:val="21"/>
+              </w:rPr>
+              <w:t xml:space="preserve"/>
+            </w:r>
+            <w:proofErr w:type="spellStart"/>
+            <w:r>
+              <w:rPr>
+                <w:sz w:val="21"/>
+              </w:rPr>
+              <w:t/>
+            </w:r>
+            <w:proofErr w:type="spellEnd"/>
+            <w:r>
+              <w:rPr>
+                <w:sz w:val="21"/>
+              </w:rPr>
+              <w:t xml:space="preserve"/>
+            </w:r>
+            <w:proofErr w:type="spellStart"/>
+            <w:r>
+              <w:rPr>
+                <w:sz w:val="21"/>
+              </w:rPr>
+              <w:t/>
+            </w:r>
+            <w:proofErr w:type="spellEnd"/>
+            <w:r>
+              <w:rPr>
+                <w:sz w:val="21"/>
+              </w:rPr>
+              <w:t xml:space="preserve"/>
+            </w:r>
+            <w:proofErr w:type="spellStart"/>
+            <w:r>
+              <w:rPr>
+                <w:sz w:val="21"/>
+              </w:rPr>
+              <w:t/>
+            </w:r>
+            <w:proofErr w:type="spellEnd"/>
+            <w:r>
+              <w:rPr>
+                <w:sz w:val="21"/>
+              </w:rPr>
+              <w:t xml:space="preserve"/>
+            </w:r>
+          </w:p>
+        </w:tc>
+      </w:tr>
+      <w:tr>
+        <w:tc>
+          <w:tcPr>
+            <w:tcW w:w="680" w:type="dxa"/>
+          </w:tcPr>
+          <w:p>
+            <w:pPr>
+              <w:spacing w:after="0" w:line="240" w:lineRule="auto"/>
+              <w:jc w:val="left"/>
+            </w:pPr>
+            <w:r>
+              <w:rPr>
+                <w:sz w:val="21"/>
+              </w:rPr>
+              <w:t>2024</w:t>
+            </w:r>
+          </w:p>
+        </w:tc>
+        <w:tc>
+          <w:tcPr>
+            <w:tcW w:w="2041" w:type="dxa"/>
+          </w:tcPr>
+          <w:p>
+            <w:pPr>
+              <w:spacing w:after="0" w:line="240" w:lineRule="auto"/>
+              <w:jc w:val="left"/>
+            </w:pPr>
+            <w:r>
+              <w:rPr>
+                <w:sz w:val="21"/>
+              </w:rPr>
+              <w:t>398.432</w:t>
+            </w:r>
+          </w:p>
+        </w:tc>
+        <w:tc>
+          <w:tcPr>
+            <w:tcW w:w="1417" w:type="dxa"/>
+          </w:tcPr>
+          <w:p>
+            <w:pPr>
+              <w:spacing w:after="0" w:line="240" w:lineRule="auto"/>
+              <w:jc w:val="left"/>
+            </w:pPr>
+            <w:proofErr w:type="spellStart"/>
+            <w:r>
+              <w:rPr>
+                <w:sz w:val="21"/>
+              </w:rPr>
+              <w:t>566.993</w:t>
+            </w:r>
+            <w:proofErr w:type="spellEnd"/>
+            <w:r>
+              <w:rPr>
+                <w:sz w:val="21"/>
+              </w:rPr>
+              <w:t xml:space="preserve"/>
+            </w:r>
+            <w:proofErr w:type="spellStart"/>
+            <w:r>
+              <w:rPr>
+                <w:sz w:val="21"/>
+              </w:rPr>
+              <w:t/>
+            </w:r>
+            <w:proofErr w:type="spellEnd"/>
+          </w:p>
+        </w:tc>
+        <w:tc>
+          <w:tcPr>
+            <w:tcW w:w="1587" w:type="dxa"/>
+          </w:tcPr>
+          <w:p>
+            <w:pPr>
+              <w:spacing w:after="0" w:line="240" w:lineRule="auto"/>
+              <w:jc w:val="left"/>
+            </w:pPr>
+            <w:r>
+              <w:rPr>
+                <w:sz w:val="21"/>
+              </w:rPr>
+              <w:t xml:space="preserve">33.203</w:t>
+            </w:r>
+            <w:proofErr w:type="spellStart"/>
+            <w:r>
+              <w:rPr>
+                <w:sz w:val="21"/>
+              </w:rPr>
+              <w:t/>
+            </w:r>
+            <w:proofErr w:type="spellEnd"/>
+            <w:r>
+              <w:rPr>
+                <w:sz w:val="21"/>
+              </w:rPr>
+              <w:t xml:space="preserve"/>
+            </w:r>
+          </w:p>
+        </w:tc>
+        <w:tc>
+          <w:tcPr>
+            <w:tcW w:w="3175" w:type="dxa"/>
+          </w:tcPr>
+          <w:p>
+            <w:pPr>
+              <w:spacing w:after="0" w:line="240" w:lineRule="auto"/>
+              <w:jc w:val="left"/>
+            </w:pPr>
+            <w:proofErr w:type="spellStart"/>
+            <w:r>
+              <w:rPr>
+                <w:sz w:val="21"/>
+              </w:rPr>
+              <w:t>47.249</w:t>
+            </w:r>
+            <w:proofErr w:type="spellEnd"/>
+            <w:r>
+              <w:rPr>
+                <w:sz w:val="21"/>
+              </w:rPr>
+              <w:t xml:space="preserve"/>
+            </w:r>
+            <w:proofErr w:type="spellStart"/>
+            <w:r>
+              <w:rPr>
+                <w:sz w:val="21"/>
+              </w:rPr>
+              <w:t/>
+            </w:r>
+            <w:proofErr w:type="spellEnd"/>
+            <w:r>
+              <w:rPr>
+                <w:sz w:val="21"/>
+              </w:rPr>
+              <w:t xml:space="preserve"/>
+            </w:r>
+            <w:proofErr w:type="spellStart"/>
+            <w:r>
+              <w:rPr>
+                <w:sz w:val="21"/>
+              </w:rPr>
+              <w:t/>
+            </w:r>
+            <w:proofErr w:type="spellEnd"/>
+            <w:r>
+              <w:rPr>
+                <w:sz w:val="21"/>
+              </w:rPr>
+              <w:t xml:space="preserve"/>
+            </w:r>
+            <w:proofErr w:type="spellStart"/>
+            <w:r>
+              <w:rPr>
+                <w:sz w:val="21"/>
+              </w:rPr>
+              <w:t/>
+            </w:r>
+            <w:proofErr w:type="spellEnd"/>
+            <w:r>
+              <w:rPr>
+                <w:sz w:val="21"/>
+              </w:rPr>
+              <w:t/>
+            </w:r>
+          </w:p>
+        </w:tc>
+      </w:tr>
+      <w:tr>
+        <w:tc>
+          <w:tcPr>
+            <w:tcW w:w="680" w:type="dxa"/>
+          </w:tcPr>
+          <w:p>
+            <w:pPr>
+              <w:spacing w:after="0" w:line="240" w:lineRule="auto"/>
+              <w:jc w:val="left"/>
+            </w:pPr>
+            <w:r>
+              <w:rPr>
+                <w:sz w:val="21"/>
+              </w:rPr>
+              <w:t>2025</w:t>
+            </w:r>
+          </w:p>
+        </w:tc>
+        <w:tc>
+          <w:tcPr>
+            <w:tcW w:w="2041" w:type="dxa"/>
+          </w:tcPr>
+          <w:p>
+            <w:pPr>
+              <w:spacing w:after="0" w:line="240" w:lineRule="auto"/>
+              <w:jc w:val="left"/>
+            </w:pPr>
+            <w:proofErr w:type="spellStart"/>
+            <w:r>
+              <w:rPr>
+                <w:sz w:val="21"/>
+              </w:rPr>
+              <w:t>109.759</w:t>
+            </w:r>
+            <w:proofErr w:type="spellEnd"/>
+          </w:p>
+        </w:tc>
+        <w:tc>
+          <w:tcPr>
+            <w:tcW w:w="1417" w:type="dxa"/>
+          </w:tcPr>
+          <w:p>
+            <w:pPr>
+              <w:spacing w:after="0" w:line="240" w:lineRule="auto"/>
+              <w:jc w:val="left"/>
+            </w:pPr>
+            <w:proofErr w:type="spellStart"/>
+            <w:r>
+              <w:rPr>
+                <w:sz w:val="21"/>
+              </w:rPr>
+              <w:t>188.478</w:t>
+            </w:r>
+            <w:proofErr w:type="spellEnd"/>
+            <w:r>
+              <w:rPr>
+                <w:sz w:val="21"/>
+              </w:rPr>
+              <w:t xml:space="preserve"/>
+            </w:r>
+            <w:proofErr w:type="spellStart"/>
+            <w:r>
+              <w:rPr>
+                <w:sz w:val="21"/>
+              </w:rPr>
+              <w:t/>
+            </w:r>
+            <w:proofErr w:type="spellEnd"/>
+          </w:p>
+        </w:tc>
+        <w:tc>
+          <w:tcPr>
+            <w:tcW w:w="1587" w:type="dxa"/>
+          </w:tcPr>
+          <w:p>
+            <w:pPr>
+              <w:spacing w:after="0" w:line="240" w:lineRule="auto"/>
+              <w:jc w:val="left"/>
+            </w:pPr>
+            <w:r>
+              <w:rPr>
+                <w:sz w:val="21"/>
+              </w:rPr>
+              <w:t>9.147</w:t>
+            </w:r>
+          </w:p>
+        </w:tc>
+        <w:tc>
+          <w:tcPr>
+            <w:tcW w:w="3175" w:type="dxa"/>
+          </w:tcPr>
+          <w:p>
+            <w:pPr>
+              <w:spacing w:after="0" w:line="240" w:lineRule="auto"/>
+              <w:jc w:val="left"/>
+            </w:pPr>
+            <w:proofErr w:type="spellStart"/>
+            <w:r>
+              <w:rPr>
+                <w:sz w:val="21"/>
+              </w:rPr>
+              <w:t>15.707</w:t>
+            </w:r>
+            <w:proofErr w:type="spellEnd"/>
+            <w:r>
+              <w:rPr>
+                <w:sz w:val="21"/>
+              </w:rPr>
+              <w:t xml:space="preserve"/>
+            </w:r>
+            <w:proofErr w:type="spellStart"/>
+            <w:r>
+              <w:rPr>
+                <w:sz w:val="21"/>
+              </w:rPr>
+              <w:t/>
+            </w:r>
+            <w:proofErr w:type="spellEnd"/>
+            <w:r>
+              <w:rPr>
+                <w:sz w:val="21"/>
+              </w:rPr>
+              <w:t xml:space="preserve"/>
+            </w:r>
+            <w:proofErr w:type="spellStart"/>
+            <w:r>
+              <w:rPr>
+                <w:sz w:val="21"/>
+              </w:rPr>
+              <w:t/>
+            </w:r>
+            <w:proofErr w:type="spellEnd"/>
+            <w:r>
+              <w:rPr>
+                <w:sz w:val="21"/>
+              </w:rPr>
+              <w:t xml:space="preserve"/>
+            </w:r>
+            <w:proofErr w:type="spellStart"/>
+            <w:r>
+              <w:rPr>
+                <w:sz w:val="21"/>
+              </w:rPr>
+              <w:t/>
+            </w:r>
+            <w:proofErr w:type="spellEnd"/>
+            <w:r>
+              <w:rPr>
+                <w:sz w:val="21"/>
+              </w:rPr>
+              <w:t xml:space="preserve"/>
+            </w:r>
+            <w:proofErr w:type="spellStart"/>
+            <w:r>
+              <w:rPr>
+                <w:sz w:val="21"/>
+              </w:rPr>
+              <w:t/>
+            </w:r>
+            <w:proofErr w:type="spellEnd"/>
+            <w:r>
+              <w:rPr>
+                <w:sz w:val="21"/>
+              </w:rPr>
+              <w:t/>
+            </w:r>
+          </w:p>
+        </w:tc>
+      </w:tr>
+    </w:tbl>
+    <w:p>
+      <w:pPr>
+        <w:pStyle w:val="BT"/>
+      </w:pPr>
+      <w:r>
+        <w:t>Năm 2022 chứa cả 11 tháng trước mốc phân chia và tháng 12 sau mốc, nên bảng theo năm chỉ dùng để mô tả đường đi của chuỗi thời gian. Kết luận trước và sau mốc vẫn dựa trên 23 và 37 tháng đã xác định trong phương pháp. Việc cả số câu hỏi lẫn số câu trả lời đều tiếp tục giảm qua các năm cho thấy một xu hướng kéo dài; riêng bảng này không cho biết phần nào của xu hướng có liên quan đến AI.</w:t>
       </w:r>
     </w:p>
     <w:p>
@@ -10762,6 +11816,14 @@
     <w:p>
       <w:pPr>
         <w:pStyle w:val="BT"/>
+      </w:pPr>
+      <w:r>
+        <w:t>Mức giảm không tập trung trong một năm đơn lẻ. Tổng số câu hỏi năm 2023 thấp hơn năm 2022 khoảng 41,0%; năm 2024 thấp hơn năm 2023 khoảng 49,4%; năm 2025 thấp hơn năm 2024 khoảng 72,5%. Số câu hỏi ở tháng cuối chuỗi là 4.195, so với 139.827 ở tháng đầu chuỗi. Những con số này cho thấy chênh lệch bình quân giữa hai giai đoạn chịu ảnh hưởng của đà giảm tiếp diễn trong cả thời kỳ sau mốc, chứ không nên hiểu là một cú giảm tức thời tại tháng 12/2022.</w:t>
+      </w:r>
+    </w:p>
+    <w:p>
+      <w:pPr>
+        <w:pStyle w:val="BT"/>
         <w:keepNext/>
         <w:jc w:val="center"/>
       </w:pPr>
@@ -12214,6 +13276,14 @@
     <w:p>
       <w:pPr>
         <w:pStyle w:val="BT"/>
+      </w:pPr>
+      <w:r>
+        <w:t>AcceptedAnswerId cho biết người hỏi đã chọn một câu trả lời, còn IsAnswered là trạng thái trả lời do API cung cấp; hai trường không diễn đạt cùng một khái niệm. Vì thế, tỷ lệ có câu trả lời được chấp nhận không thể thay cho tỷ lệ câu hỏi đã được giải đáp hoặc chất lượng câu trả lời. Các câu hỏi đăng muộn cũng có ít thời gian hơn để nhận bình chọn và được chấp nhận trước ngày thu thập. Nhóm chỉ dùng các tỷ lệ này để mô tả trạng thái quan sát được tại thời điểm thu thập.</w:t>
+      </w:r>
+    </w:p>
+    <w:p>
+      <w:pPr>
+        <w:pStyle w:val="BT"/>
         <w:keepNext/>
         <w:jc w:val="center"/>
       </w:pPr>
@@ -13019,6 +14089,14 @@
     <w:p>
       <w:pPr>
         <w:pStyle w:val="BT"/>
+      </w:pPr>
+      <w:r>
+        <w:t>Về tỷ trọng, câu hỏi gắn tag python chiếm khoảng 16,5% toàn bộ câu hỏi ở giai đoạn Before AI và 13,8% ở giai đoạn After AI; javascript giảm từ 11,4% xuống 8,4%. Ngược lại, next.js tăng từ khoảng 0,6% lên 1,4% dù số câu hỏi bình quân tháng của tag này vẫn giảm. Các tag AI/LLM tăng từ nền ban đầu rất nhỏ, nên tốc độ tăng lớn không có nghĩa chúng chiếm phần lớn hoạt động trên trang. Tập 31 tag được lựa chọn để khảo sát không đại diện cho mọi chủ đề của Stack Overflow, và một câu hỏi có thể được tính vào nhiều tag.</w:t>
+      </w:r>
+    </w:p>
+    <w:p>
+      <w:pPr>
+        <w:pStyle w:val="BT"/>
         <w:pageBreakBefore/>
         <w:spacing w:after="680"/>
       </w:pPr>
@@ -13587,7 +14665,32 @@
     </w:p>
     <w:p>
       <w:pPr>
+        <w:pStyle w:val="Heading2"/>
+      </w:pPr>
+      <w:r>
+        <w:t>Độ tin cậy và phạm vi kết luận</w:t>
+      </w:r>
+    </w:p>
+    <w:p>
+      <w:pPr>
+        <w:pStyle w:val="BT"/>
+      </w:pPr>
+      <w:r>
+        <w:t>Các thước đo cho thấy hai mức biến động khác nhau. Khối lượng câu hỏi đăng mới giảm 68,8% theo bình quân tháng, trong khi số câu trả lời mà một câu hỏi mới nhận được giảm 13,7% theo ước lượng có trọng số. Hai tỷ lệ không thể cộng hay thay thế cho nhau: tỷ lệ đầu mô tả tổng lượng bài đăng, còn tỷ lệ sau mô tả thuộc tính của một câu hỏi trong mẫu. Kết quả về Score và câu trả lời được chấp nhận cũng chỉ áp dụng cho trạng thái các câu hỏi mẫu tại ngày thu thập.</w:t>
+      </w:r>
+    </w:p>
+    <w:p>
+      <w:pPr>
+        <w:pStyle w:val="BT"/>
+      </w:pPr>
+      <w:r>
+        <w:t>Phép so sánh trước và sau không có nhóm đối chứng và không đo mức sử dụng AI của người đặt câu hỏi. Mốc tháng 12/2022 chỉ phân chia chuỗi thời gian; dữ liệu không kiểm soát các yếu tố cùng thay đổi. Do đó, kết quả không ước lượng được riêng tác động của AI. Để nghiên cứu câu hỏi này cần dữ liệu về việc sử dụng AI và thiết kế so sánh có nhóm đối chứng.</w:t>
+      </w:r>
+    </w:p>
+    <w:p>
+      <w:pPr>
         <w:pStyle w:val="Heading1"/>
+        <w:pageBreakBefore/>
       </w:pPr>
       <w:r>
         <w:tab/>

</xml_diff>

<commit_message>
Describe all three data files in report and notebook
</commit_message>
<xml_diff>
--- a/Nhom6_Bao_cao.docx
+++ b/Nhom6_Bao_cao.docx
@@ -2084,543 +2084,7 @@
         <w:pStyle w:val="BT"/>
       </w:pPr>
       <w:r>
-        <w:t xml:space="preserve">Ba </w:t>
-      </w:r>
-      <w:proofErr w:type="spellStart"/>
-      <w:r>
-        <w:t>bảng</w:t>
-      </w:r>
-      <w:proofErr w:type="spellEnd"/>
-      <w:r>
-        <w:t xml:space="preserve"> </w:t>
-      </w:r>
-      <w:proofErr w:type="spellStart"/>
-      <w:r>
-        <w:t>dữ</w:t>
-      </w:r>
-      <w:proofErr w:type="spellEnd"/>
-      <w:r>
-        <w:t xml:space="preserve"> </w:t>
-      </w:r>
-      <w:proofErr w:type="spellStart"/>
-      <w:r>
-        <w:t>liệu</w:t>
-      </w:r>
-      <w:proofErr w:type="spellEnd"/>
-      <w:r>
-        <w:t xml:space="preserve"> </w:t>
-      </w:r>
-      <w:proofErr w:type="spellStart"/>
-      <w:r>
-        <w:t>được</w:t>
-      </w:r>
-      <w:proofErr w:type="spellEnd"/>
-      <w:r>
-        <w:t xml:space="preserve"> </w:t>
-      </w:r>
-      <w:proofErr w:type="spellStart"/>
-      <w:r>
-        <w:t>lập</w:t>
-      </w:r>
-      <w:proofErr w:type="spellEnd"/>
-      <w:r>
-        <w:t xml:space="preserve"> </w:t>
-      </w:r>
-      <w:proofErr w:type="spellStart"/>
-      <w:r>
-        <w:t>từ</w:t>
-      </w:r>
-      <w:proofErr w:type="spellEnd"/>
-      <w:r>
-        <w:t xml:space="preserve"> Stack Exchange API [1]. </w:t>
-      </w:r>
-      <w:proofErr w:type="spellStart"/>
-      <w:r>
-        <w:t>Bảng</w:t>
-      </w:r>
-      <w:proofErr w:type="spellEnd"/>
-      <w:r>
-        <w:t xml:space="preserve"> so_monthly_totals.csv </w:t>
-      </w:r>
-      <w:proofErr w:type="spellStart"/>
-      <w:r>
-        <w:t>có</w:t>
-      </w:r>
-      <w:proofErr w:type="spellEnd"/>
-      <w:r>
-        <w:t xml:space="preserve"> 60 </w:t>
-      </w:r>
-      <w:proofErr w:type="spellStart"/>
-      <w:r>
-        <w:t>dòng</w:t>
-      </w:r>
-      <w:proofErr w:type="spellEnd"/>
-      <w:r>
-        <w:t xml:space="preserve">, </w:t>
-      </w:r>
-      <w:proofErr w:type="spellStart"/>
-      <w:r>
-        <w:t>mỗi</w:t>
-      </w:r>
-      <w:proofErr w:type="spellEnd"/>
-      <w:r>
-        <w:t xml:space="preserve"> </w:t>
-      </w:r>
-      <w:proofErr w:type="spellStart"/>
-      <w:r>
-        <w:t>dòng</w:t>
-      </w:r>
-      <w:proofErr w:type="spellEnd"/>
-      <w:r>
-        <w:t xml:space="preserve"> </w:t>
-      </w:r>
-      <w:proofErr w:type="spellStart"/>
-      <w:r>
-        <w:t>gồm</w:t>
-      </w:r>
-      <w:proofErr w:type="spellEnd"/>
-      <w:r>
-        <w:t xml:space="preserve"> </w:t>
-      </w:r>
-      <w:proofErr w:type="spellStart"/>
-      <w:r>
-        <w:t>số</w:t>
-      </w:r>
-      <w:proofErr w:type="spellEnd"/>
-      <w:r>
-        <w:t xml:space="preserve"> Questions </w:t>
-      </w:r>
-      <w:proofErr w:type="spellStart"/>
-      <w:r>
-        <w:t>và</w:t>
-      </w:r>
-      <w:proofErr w:type="spellEnd"/>
-      <w:r>
-        <w:t xml:space="preserve"> Answers </w:t>
-      </w:r>
-      <w:proofErr w:type="spellStart"/>
-      <w:r>
-        <w:t>của</w:t>
-      </w:r>
-      <w:proofErr w:type="spellEnd"/>
-      <w:r>
-        <w:t xml:space="preserve"> </w:t>
-      </w:r>
-      <w:proofErr w:type="spellStart"/>
-      <w:r>
-        <w:t>một</w:t>
-      </w:r>
-      <w:proofErr w:type="spellEnd"/>
-      <w:r>
-        <w:t xml:space="preserve"> </w:t>
-      </w:r>
-      <w:proofErr w:type="spellStart"/>
-      <w:r>
-        <w:t>tháng</w:t>
-      </w:r>
-      <w:proofErr w:type="spellEnd"/>
-      <w:r>
-        <w:t xml:space="preserve">; </w:t>
-      </w:r>
-      <w:proofErr w:type="spellStart"/>
-      <w:r>
-        <w:t>tổng</w:t>
-      </w:r>
-      <w:proofErr w:type="spellEnd"/>
-      <w:r>
-        <w:t xml:space="preserve"> </w:t>
-      </w:r>
-      <w:proofErr w:type="spellStart"/>
-      <w:r>
-        <w:t>cộng</w:t>
-      </w:r>
-      <w:proofErr w:type="spellEnd"/>
-      <w:r>
-        <w:t xml:space="preserve"> </w:t>
-      </w:r>
-      <w:proofErr w:type="spellStart"/>
-      <w:r>
-        <w:t>ghi</w:t>
-      </w:r>
-      <w:proofErr w:type="spellEnd"/>
-      <w:r>
-        <w:t xml:space="preserve"> </w:t>
-      </w:r>
-      <w:proofErr w:type="spellStart"/>
-      <w:r>
-        <w:t>nhận</w:t>
-      </w:r>
-      <w:proofErr w:type="spellEnd"/>
-      <w:r>
-        <w:t xml:space="preserve"> 4.165.547 </w:t>
-      </w:r>
-      <w:proofErr w:type="spellStart"/>
-      <w:r>
-        <w:t>câu</w:t>
-      </w:r>
-      <w:proofErr w:type="spellEnd"/>
-      <w:r>
-        <w:t xml:space="preserve"> </w:t>
-      </w:r>
-      <w:proofErr w:type="spellStart"/>
-      <w:r>
-        <w:t>hỏi</w:t>
-      </w:r>
-      <w:proofErr w:type="spellEnd"/>
-      <w:r>
-        <w:t xml:space="preserve"> </w:t>
-      </w:r>
-      <w:proofErr w:type="spellStart"/>
-      <w:r>
-        <w:t>và</w:t>
-      </w:r>
-      <w:proofErr w:type="spellEnd"/>
-      <w:r>
-        <w:t xml:space="preserve"> 5.486.140 </w:t>
-      </w:r>
-      <w:proofErr w:type="spellStart"/>
-      <w:r>
-        <w:t>câu</w:t>
-      </w:r>
-      <w:proofErr w:type="spellEnd"/>
-      <w:r>
-        <w:t xml:space="preserve"> </w:t>
-      </w:r>
-      <w:proofErr w:type="spellStart"/>
-      <w:r>
-        <w:t>trả</w:t>
-      </w:r>
-      <w:proofErr w:type="spellEnd"/>
-      <w:r>
-        <w:t xml:space="preserve"> </w:t>
-      </w:r>
-      <w:proofErr w:type="spellStart"/>
-      <w:r>
-        <w:t>lời</w:t>
-      </w:r>
-      <w:proofErr w:type="spellEnd"/>
-      <w:r>
-        <w:t xml:space="preserve">. </w:t>
-      </w:r>
-      <w:proofErr w:type="spellStart"/>
-      <w:r>
-        <w:t>Bảng</w:t>
-      </w:r>
-      <w:proofErr w:type="spellEnd"/>
-      <w:r>
-        <w:t xml:space="preserve"> so_questions_sample.csv </w:t>
-      </w:r>
-      <w:proofErr w:type="spellStart"/>
-      <w:r>
-        <w:t>có</w:t>
-      </w:r>
-      <w:proofErr w:type="spellEnd"/>
-      <w:r>
-        <w:t xml:space="preserve"> 6.000 </w:t>
-      </w:r>
-      <w:proofErr w:type="spellStart"/>
-      <w:r>
-        <w:t>câu</w:t>
-      </w:r>
-      <w:proofErr w:type="spellEnd"/>
-      <w:r>
-        <w:t xml:space="preserve"> </w:t>
-      </w:r>
-      <w:proofErr w:type="spellStart"/>
-      <w:r>
-        <w:t>hỏi</w:t>
-      </w:r>
-      <w:proofErr w:type="spellEnd"/>
-      <w:r>
-        <w:t xml:space="preserve"> </w:t>
-      </w:r>
-      <w:proofErr w:type="spellStart"/>
-      <w:r>
-        <w:t>và</w:t>
-      </w:r>
-      <w:proofErr w:type="spellEnd"/>
-      <w:r>
-        <w:t xml:space="preserve"> 13 </w:t>
-      </w:r>
-      <w:proofErr w:type="spellStart"/>
-      <w:r>
-        <w:t>cột</w:t>
-      </w:r>
-      <w:proofErr w:type="spellEnd"/>
-      <w:r>
-        <w:t xml:space="preserve">: 10 </w:t>
-      </w:r>
-      <w:proofErr w:type="spellStart"/>
-      <w:r>
-        <w:t>trường</w:t>
-      </w:r>
-      <w:proofErr w:type="spellEnd"/>
-      <w:r>
-        <w:t xml:space="preserve"> </w:t>
-      </w:r>
-      <w:proofErr w:type="spellStart"/>
-      <w:r>
-        <w:t>gốc</w:t>
-      </w:r>
-      <w:proofErr w:type="spellEnd"/>
-      <w:r>
-        <w:t xml:space="preserve"> </w:t>
-      </w:r>
-      <w:proofErr w:type="spellStart"/>
-      <w:r>
-        <w:t>từ</w:t>
-      </w:r>
-      <w:proofErr w:type="spellEnd"/>
-      <w:r>
-        <w:t xml:space="preserve"> API, 3 </w:t>
-      </w:r>
-      <w:proofErr w:type="spellStart"/>
-      <w:r>
-        <w:t>cột</w:t>
-      </w:r>
-      <w:proofErr w:type="spellEnd"/>
-      <w:r>
-        <w:t xml:space="preserve"> </w:t>
-      </w:r>
-      <w:proofErr w:type="spellStart"/>
-      <w:r>
-        <w:t>được</w:t>
-      </w:r>
-      <w:proofErr w:type="spellEnd"/>
-      <w:r>
-        <w:t xml:space="preserve"> </w:t>
-      </w:r>
-      <w:proofErr w:type="spellStart"/>
-      <w:r>
-        <w:t>nhóm</w:t>
-      </w:r>
-      <w:proofErr w:type="spellEnd"/>
-      <w:r>
-        <w:t xml:space="preserve"> </w:t>
-      </w:r>
-      <w:proofErr w:type="spellStart"/>
-      <w:r>
-        <w:t>tính</w:t>
-      </w:r>
-      <w:proofErr w:type="spellEnd"/>
-      <w:r>
-        <w:t xml:space="preserve"> </w:t>
-      </w:r>
-      <w:proofErr w:type="spellStart"/>
-      <w:r>
-        <w:t>thêm</w:t>
-      </w:r>
-      <w:proofErr w:type="spellEnd"/>
-      <w:r>
-        <w:t xml:space="preserve">. </w:t>
-      </w:r>
-      <w:proofErr w:type="spellStart"/>
-      <w:r>
-        <w:t>Bảng</w:t>
-      </w:r>
-      <w:proofErr w:type="spellEnd"/>
-      <w:r>
-        <w:t xml:space="preserve"> so_tag_counts.csv </w:t>
-      </w:r>
-      <w:proofErr w:type="spellStart"/>
-      <w:r>
-        <w:t>có</w:t>
-      </w:r>
-      <w:proofErr w:type="spellEnd"/>
-      <w:r>
-        <w:t xml:space="preserve"> 62 </w:t>
-      </w:r>
-      <w:proofErr w:type="spellStart"/>
-      <w:r>
-        <w:t>dòng</w:t>
-      </w:r>
-      <w:proofErr w:type="spellEnd"/>
-      <w:r>
-        <w:t xml:space="preserve"> </w:t>
-      </w:r>
-      <w:proofErr w:type="spellStart"/>
-      <w:r>
-        <w:t>cho</w:t>
-      </w:r>
-      <w:proofErr w:type="spellEnd"/>
-      <w:r>
-        <w:t xml:space="preserve"> 31 tag ở </w:t>
-      </w:r>
-      <w:proofErr w:type="spellStart"/>
-      <w:r>
-        <w:t>hai</w:t>
-      </w:r>
-      <w:proofErr w:type="spellEnd"/>
-      <w:r>
-        <w:t xml:space="preserve"> </w:t>
-      </w:r>
-      <w:proofErr w:type="spellStart"/>
-      <w:r>
-        <w:t>giai</w:t>
-      </w:r>
-      <w:proofErr w:type="spellEnd"/>
-      <w:r>
-        <w:t xml:space="preserve"> </w:t>
-      </w:r>
-      <w:proofErr w:type="spellStart"/>
-      <w:r>
-        <w:t>đoạn</w:t>
-      </w:r>
-      <w:proofErr w:type="spellEnd"/>
-      <w:r>
-        <w:t xml:space="preserve">, </w:t>
-      </w:r>
-      <w:proofErr w:type="spellStart"/>
-      <w:r>
-        <w:t>gồm</w:t>
-      </w:r>
-      <w:proofErr w:type="spellEnd"/>
-      <w:r>
-        <w:t xml:space="preserve"> 25 tag </w:t>
-      </w:r>
-      <w:proofErr w:type="spellStart"/>
-      <w:r>
-        <w:t>công</w:t>
-      </w:r>
-      <w:proofErr w:type="spellEnd"/>
-      <w:r>
-        <w:t xml:space="preserve"> </w:t>
-      </w:r>
-      <w:proofErr w:type="spellStart"/>
-      <w:r>
-        <w:t>nghệ</w:t>
-      </w:r>
-      <w:proofErr w:type="spellEnd"/>
-      <w:r>
-        <w:t xml:space="preserve"> </w:t>
-      </w:r>
-      <w:proofErr w:type="spellStart"/>
-      <w:r>
-        <w:t>và</w:t>
-      </w:r>
-      <w:proofErr w:type="spellEnd"/>
-      <w:r>
-        <w:t xml:space="preserve"> 6 tag AI/LLM. Thông tin </w:t>
-      </w:r>
-      <w:proofErr w:type="spellStart"/>
-      <w:r>
-        <w:t>thời</w:t>
-      </w:r>
-      <w:proofErr w:type="spellEnd"/>
-      <w:r>
-        <w:t xml:space="preserve"> </w:t>
-      </w:r>
-      <w:proofErr w:type="spellStart"/>
-      <w:r>
-        <w:t>điểm</w:t>
-      </w:r>
-      <w:proofErr w:type="spellEnd"/>
-      <w:r>
-        <w:t xml:space="preserve"> </w:t>
-      </w:r>
-      <w:proofErr w:type="spellStart"/>
-      <w:r>
-        <w:t>thu</w:t>
-      </w:r>
-      <w:proofErr w:type="spellEnd"/>
-      <w:r>
-        <w:t xml:space="preserve"> </w:t>
-      </w:r>
-      <w:proofErr w:type="spellStart"/>
-      <w:r>
-        <w:t>thập</w:t>
-      </w:r>
-      <w:proofErr w:type="spellEnd"/>
-      <w:r>
-        <w:t xml:space="preserve">, </w:t>
-      </w:r>
-      <w:proofErr w:type="spellStart"/>
-      <w:r>
-        <w:t>mốc</w:t>
-      </w:r>
-      <w:proofErr w:type="spellEnd"/>
-      <w:r>
-        <w:t xml:space="preserve"> </w:t>
-      </w:r>
-      <w:proofErr w:type="spellStart"/>
-      <w:r>
-        <w:t>tháng</w:t>
-      </w:r>
-      <w:proofErr w:type="spellEnd"/>
-      <w:r>
-        <w:t xml:space="preserve"> </w:t>
-      </w:r>
-      <w:proofErr w:type="spellStart"/>
-      <w:r>
-        <w:t>và</w:t>
-      </w:r>
-      <w:proofErr w:type="spellEnd"/>
-      <w:r>
-        <w:t xml:space="preserve"> </w:t>
-      </w:r>
-      <w:proofErr w:type="spellStart"/>
-      <w:r>
-        <w:t>hạt</w:t>
-      </w:r>
-      <w:proofErr w:type="spellEnd"/>
-      <w:r>
-        <w:t xml:space="preserve"> </w:t>
-      </w:r>
-      <w:proofErr w:type="spellStart"/>
-      <w:r>
-        <w:t>giống</w:t>
-      </w:r>
-      <w:proofErr w:type="spellEnd"/>
-      <w:r>
-        <w:t xml:space="preserve"> </w:t>
-      </w:r>
-      <w:proofErr w:type="spellStart"/>
-      <w:r>
-        <w:t>lấy</w:t>
-      </w:r>
-      <w:proofErr w:type="spellEnd"/>
-      <w:r>
-        <w:t xml:space="preserve"> </w:t>
-      </w:r>
-      <w:proofErr w:type="spellStart"/>
-      <w:r>
-        <w:t>mẫu</w:t>
-      </w:r>
-      <w:proofErr w:type="spellEnd"/>
-      <w:r>
-        <w:t xml:space="preserve"> </w:t>
-      </w:r>
-      <w:proofErr w:type="spellStart"/>
-      <w:r>
-        <w:t>được</w:t>
-      </w:r>
-      <w:proofErr w:type="spellEnd"/>
-      <w:r>
-        <w:t xml:space="preserve"> </w:t>
-      </w:r>
-      <w:proofErr w:type="spellStart"/>
-      <w:r>
-        <w:t>lưu</w:t>
-      </w:r>
-      <w:proofErr w:type="spellEnd"/>
-      <w:r>
-        <w:t xml:space="preserve"> </w:t>
-      </w:r>
-      <w:proofErr w:type="spellStart"/>
-      <w:r>
-        <w:t>trong</w:t>
-      </w:r>
-      <w:proofErr w:type="spellEnd"/>
-      <w:r>
-        <w:t xml:space="preserve"> </w:t>
-      </w:r>
-      <w:proofErr w:type="spellStart"/>
-      <w:r>
-        <w:t>collection_info.json</w:t>
-      </w:r>
-      <w:proofErr w:type="spellEnd"/>
-      <w:r>
-        <w:t>.</w:t>
+        <w:t>Ba tệp CSV được thu thập từ Stack Exchange API [1]. so_monthly_totals.csv có 60 dòng × 3 cột, mỗi dòng là một tháng (01/2021–12/2025): Month là chuỗi YYYY-MM; Questions và Answers là số nguyên đếm câu hỏi và câu trả lời đăng trong tháng. Không có tháng trùng hoặc giá trị khuyết; tổng cộng 4.165.547 câu hỏi và 5.486.140 câu trả lời. so_questions_sample.csv có 6.000 dòng × 13 cột, mỗi dòng là một câu hỏi (100 câu hỏi/tháng); 10 cột từ API và 3 cột tính thêm được giải thích ở Bảng 1. so_tag_counts.csv có 62 dòng × 5 cột, gồm 31 tag trong hai giai đoạn: 25 tag lập trình và 6 tag AI/LLM. Thông tin lần thu thập được lưu trong collection_info.json.</w:t>
       </w:r>
     </w:p>
     <w:p>
@@ -3369,7 +2833,7 @@
         <w:pStyle w:val="BT"/>
       </w:pPr>
       <w:r>
-        <w:t>Ba bảng có đơn vị quan sát khác nhau. Bảng tổng theo tháng phản ánh toàn bộ số bài đăng trong khoảng thời gian khảo sát; bảng câu hỏi mẫu chỉ cung cấp thuộc tính của 100 câu hỏi được lấy ở mỗi tháng; bảng tag đếm câu hỏi mang từng nhãn đã chọn. Vì vậy, các tỷ lệ về Score, câu trả lời được chấp nhận hoặc số câu trả lời mà một câu hỏi nhận được phải tính từ mẫu và được trình bày như ước lượng. Không thể lấy 6.000 dòng mẫu làm mẫu số cho số đếm của toàn trang.</w:t>
+        <w:t>Trong so_tag_counts.csv, Tag (chuỗi) là tên nhãn; Period (Before/After) là giai đoạn; Questions (số nguyên) đếm câu hỏi gắn nhãn; Months (số nguyên) là 23 hoặc 37 tháng; Group (chuỗi) phân loại Programming hoặc AI/LLM. Mỗi cặp Tag–Period là duy nhất và cả năm cột không khuyết. Ba bảng có đơn vị quan sát khác nhau: số bài đăng toàn trang theo tháng, thuộc tính của câu hỏi mẫu, và số câu hỏi theo tag trong giai đoạn. Chỉ số cấp câu hỏi là ước lượng từ mẫu; một câu hỏi có thể mang nhiều tag.</w:t>
       </w:r>
     </w:p>
     <w:tbl>

</xml_diff>

<commit_message>
Describe all three CSV datasets in IE313 report
</commit_message>
<xml_diff>
--- a/Nhom6_Bao_cao.docx
+++ b/Nhom6_Bao_cao.docx
@@ -706,748 +706,21 @@
         <w:pStyle w:val="BT"/>
       </w:pPr>
       <w:r>
-        <w:t>Ba tệp CSV được thu thập từ Stack Exchange API [1]. so_monthly_totals.csv có 60 dòng × 3 cột, mỗi dòng là một tháng (01/2021–12/2025): Month là chuỗi YYYY-MM; Questions và Answers là số nguyên đếm câu hỏi và câu trả lời đăng trong tháng. Không có tháng trùng hoặc giá trị khuyết; tổng cộng 4.165.547 câu hỏi và 5.486.140 câu trả lời. so_questions_sample.csv có 6.000 dòng × 13 cột, mỗi dòng là một câu hỏi (100 câu hỏi/tháng); 10 cột từ API và 3 cột tính thêm được giải thích ở Bảng 1. so_tag_counts.csv có 62 dòng × 5 cột, gồm 31 tag trong hai giai đoạn: 25 tag lập trình và 6 tag AI/LLM. Thông tin lần thu thập được lưu trong collection_info.json.</w:t>
+        <w:t>Bộ dữ liệu do nhóm tự thu thập qua Stack Exchange API [1] ngày 23/09/2026 (UTC). Dữ liệu gồm ba tệp CSV; tính riêng cho từng tệp có tổng cộng 21 cột (3 + 13 + 5), trong đó một số tên cột được dùng ở nhiều tệp. Thông tin lần thu thập được lưu trong collection_info.json.</w:t>
       </w:r>
     </w:p>
     <w:p>
       <w:pPr>
         <w:pStyle w:val="BT"/>
       </w:pPr>
-      <w:proofErr w:type="spellStart"/>
-      <w:r>
-        <w:t>Dữ</w:t>
-      </w:r>
-      <w:proofErr w:type="spellEnd"/>
-      <w:r>
-        <w:t xml:space="preserve"> </w:t>
-      </w:r>
-      <w:proofErr w:type="spellStart"/>
-      <w:r>
-        <w:t>liệu</w:t>
-      </w:r>
-      <w:proofErr w:type="spellEnd"/>
-      <w:r>
-        <w:t xml:space="preserve"> </w:t>
-      </w:r>
-      <w:proofErr w:type="spellStart"/>
-      <w:r>
-        <w:t>được</w:t>
-      </w:r>
-      <w:proofErr w:type="spellEnd"/>
-      <w:r>
-        <w:t xml:space="preserve"> </w:t>
-      </w:r>
-      <w:proofErr w:type="spellStart"/>
-      <w:r>
-        <w:t>thu</w:t>
-      </w:r>
-      <w:proofErr w:type="spellEnd"/>
-      <w:r>
-        <w:t xml:space="preserve"> </w:t>
-      </w:r>
-      <w:proofErr w:type="spellStart"/>
-      <w:r>
-        <w:t>thập</w:t>
-      </w:r>
-      <w:proofErr w:type="spellEnd"/>
-      <w:r>
-        <w:t xml:space="preserve"> </w:t>
-      </w:r>
-      <w:proofErr w:type="spellStart"/>
-      <w:r>
-        <w:t>ngày</w:t>
-      </w:r>
-      <w:proofErr w:type="spellEnd"/>
-      <w:r>
-        <w:t xml:space="preserve"> 23/09/2026 (UTC). </w:t>
-      </w:r>
-      <w:proofErr w:type="spellStart"/>
-      <w:r>
-        <w:t>Với</w:t>
-      </w:r>
-      <w:proofErr w:type="spellEnd"/>
-      <w:r>
-        <w:t xml:space="preserve"> </w:t>
-      </w:r>
-      <w:proofErr w:type="spellStart"/>
-      <w:r>
-        <w:t>mỗi</w:t>
-      </w:r>
-      <w:proofErr w:type="spellEnd"/>
-      <w:r>
-        <w:t xml:space="preserve"> </w:t>
-      </w:r>
-      <w:proofErr w:type="spellStart"/>
-      <w:r>
-        <w:t>tháng</w:t>
-      </w:r>
-      <w:proofErr w:type="spellEnd"/>
-      <w:r>
-        <w:t xml:space="preserve"> </w:t>
-      </w:r>
-      <w:proofErr w:type="spellStart"/>
-      <w:r>
-        <w:t>từ</w:t>
-      </w:r>
-      <w:proofErr w:type="spellEnd"/>
-      <w:r>
-        <w:t xml:space="preserve"> 01/2021 </w:t>
-      </w:r>
-      <w:proofErr w:type="spellStart"/>
-      <w:r>
-        <w:t>đến</w:t>
-      </w:r>
-      <w:proofErr w:type="spellEnd"/>
-      <w:r>
-        <w:t xml:space="preserve"> 12/2025, </w:t>
-      </w:r>
-      <w:proofErr w:type="spellStart"/>
-      <w:r>
-        <w:t>truy</w:t>
-      </w:r>
-      <w:proofErr w:type="spellEnd"/>
-      <w:r>
-        <w:t xml:space="preserve"> </w:t>
-      </w:r>
-      <w:proofErr w:type="spellStart"/>
-      <w:r>
-        <w:t>vấn</w:t>
-      </w:r>
-      <w:proofErr w:type="spellEnd"/>
-      <w:r>
-        <w:t xml:space="preserve"> /questions </w:t>
-      </w:r>
-      <w:proofErr w:type="spellStart"/>
-      <w:r>
-        <w:t>và</w:t>
-      </w:r>
-      <w:proofErr w:type="spellEnd"/>
-      <w:r>
-        <w:t xml:space="preserve"> /answers </w:t>
-      </w:r>
-      <w:proofErr w:type="spellStart"/>
-      <w:r>
-        <w:t>lấy</w:t>
-      </w:r>
-      <w:proofErr w:type="spellEnd"/>
-      <w:r>
-        <w:t xml:space="preserve"> </w:t>
-      </w:r>
-      <w:proofErr w:type="spellStart"/>
-      <w:r>
-        <w:t>tổng</w:t>
-      </w:r>
-      <w:proofErr w:type="spellEnd"/>
-      <w:r>
-        <w:t xml:space="preserve"> </w:t>
-      </w:r>
-      <w:proofErr w:type="spellStart"/>
-      <w:r>
-        <w:t>số</w:t>
-      </w:r>
-      <w:proofErr w:type="spellEnd"/>
-      <w:r>
-        <w:t xml:space="preserve"> </w:t>
-      </w:r>
-      <w:proofErr w:type="spellStart"/>
-      <w:r>
-        <w:t>bài</w:t>
-      </w:r>
-      <w:proofErr w:type="spellEnd"/>
-      <w:r>
-        <w:t xml:space="preserve"> </w:t>
-      </w:r>
-      <w:proofErr w:type="spellStart"/>
-      <w:r>
-        <w:t>đăng</w:t>
-      </w:r>
-      <w:proofErr w:type="spellEnd"/>
-      <w:r>
-        <w:t xml:space="preserve">. </w:t>
-      </w:r>
-      <w:proofErr w:type="spellStart"/>
-      <w:r>
-        <w:t>Để</w:t>
-      </w:r>
-      <w:proofErr w:type="spellEnd"/>
-      <w:r>
-        <w:t xml:space="preserve"> </w:t>
-      </w:r>
-      <w:proofErr w:type="spellStart"/>
-      <w:r>
-        <w:t>có</w:t>
-      </w:r>
-      <w:proofErr w:type="spellEnd"/>
-      <w:r>
-        <w:t xml:space="preserve"> </w:t>
-      </w:r>
-      <w:proofErr w:type="spellStart"/>
-      <w:r>
-        <w:t>thuộc</w:t>
-      </w:r>
-      <w:proofErr w:type="spellEnd"/>
-      <w:r>
-        <w:t xml:space="preserve"> </w:t>
-      </w:r>
-      <w:proofErr w:type="spellStart"/>
-      <w:r>
-        <w:t>tính</w:t>
-      </w:r>
-      <w:proofErr w:type="spellEnd"/>
-      <w:r>
-        <w:t xml:space="preserve"> </w:t>
-      </w:r>
-      <w:proofErr w:type="spellStart"/>
-      <w:r>
-        <w:t>của</w:t>
-      </w:r>
-      <w:proofErr w:type="spellEnd"/>
-      <w:r>
-        <w:t xml:space="preserve"> </w:t>
-      </w:r>
-      <w:proofErr w:type="spellStart"/>
-      <w:r>
-        <w:t>từng</w:t>
-      </w:r>
-      <w:proofErr w:type="spellEnd"/>
-      <w:r>
-        <w:t xml:space="preserve"> </w:t>
-      </w:r>
-      <w:proofErr w:type="spellStart"/>
-      <w:r>
-        <w:t>câu</w:t>
-      </w:r>
-      <w:proofErr w:type="spellEnd"/>
-      <w:r>
-        <w:t xml:space="preserve"> </w:t>
-      </w:r>
-      <w:proofErr w:type="spellStart"/>
-      <w:r>
-        <w:t>hỏi</w:t>
-      </w:r>
-      <w:proofErr w:type="spellEnd"/>
-      <w:r>
-        <w:t xml:space="preserve">, </w:t>
-      </w:r>
-      <w:proofErr w:type="spellStart"/>
-      <w:r>
-        <w:t>mỗi</w:t>
-      </w:r>
-      <w:proofErr w:type="spellEnd"/>
-      <w:r>
-        <w:t xml:space="preserve"> </w:t>
-      </w:r>
-      <w:proofErr w:type="spellStart"/>
-      <w:r>
-        <w:t>tháng</w:t>
-      </w:r>
-      <w:proofErr w:type="spellEnd"/>
-      <w:r>
-        <w:t xml:space="preserve"> </w:t>
-      </w:r>
-      <w:proofErr w:type="spellStart"/>
-      <w:r>
-        <w:t>chọn</w:t>
-      </w:r>
-      <w:proofErr w:type="spellEnd"/>
-      <w:r>
-        <w:t xml:space="preserve"> </w:t>
-      </w:r>
-      <w:proofErr w:type="spellStart"/>
-      <w:r>
-        <w:t>một</w:t>
-      </w:r>
-      <w:proofErr w:type="spellEnd"/>
-      <w:r>
-        <w:t xml:space="preserve"> </w:t>
-      </w:r>
-      <w:proofErr w:type="spellStart"/>
-      <w:r>
-        <w:t>thời</w:t>
-      </w:r>
-      <w:proofErr w:type="spellEnd"/>
-      <w:r>
-        <w:t xml:space="preserve"> </w:t>
-      </w:r>
-      <w:proofErr w:type="spellStart"/>
-      <w:r>
-        <w:t>điểm</w:t>
-      </w:r>
-      <w:proofErr w:type="spellEnd"/>
-      <w:r>
-        <w:t xml:space="preserve"> </w:t>
-      </w:r>
-      <w:proofErr w:type="spellStart"/>
-      <w:r>
-        <w:t>bắt</w:t>
-      </w:r>
-      <w:proofErr w:type="spellEnd"/>
-      <w:r>
-        <w:t xml:space="preserve"> </w:t>
-      </w:r>
-      <w:proofErr w:type="spellStart"/>
-      <w:r>
-        <w:t>đầu</w:t>
-      </w:r>
-      <w:proofErr w:type="spellEnd"/>
-      <w:r>
-        <w:t xml:space="preserve"> </w:t>
-      </w:r>
-      <w:proofErr w:type="spellStart"/>
-      <w:r>
-        <w:t>bằng</w:t>
-      </w:r>
-      <w:proofErr w:type="spellEnd"/>
-      <w:r>
-        <w:t xml:space="preserve"> </w:t>
-      </w:r>
-      <w:proofErr w:type="spellStart"/>
-      <w:r>
-        <w:t>bộ</w:t>
-      </w:r>
-      <w:proofErr w:type="spellEnd"/>
-      <w:r>
-        <w:t xml:space="preserve"> </w:t>
-      </w:r>
-      <w:proofErr w:type="spellStart"/>
-      <w:r>
-        <w:t>sinh</w:t>
-      </w:r>
-      <w:proofErr w:type="spellEnd"/>
-      <w:r>
-        <w:t xml:space="preserve"> </w:t>
-      </w:r>
-      <w:proofErr w:type="spellStart"/>
-      <w:r>
-        <w:t>số</w:t>
-      </w:r>
-      <w:proofErr w:type="spellEnd"/>
-      <w:r>
-        <w:t xml:space="preserve"> </w:t>
-      </w:r>
-      <w:proofErr w:type="spellStart"/>
-      <w:r>
-        <w:t>giả</w:t>
-      </w:r>
-      <w:proofErr w:type="spellEnd"/>
-      <w:r>
-        <w:t xml:space="preserve"> </w:t>
-      </w:r>
-      <w:proofErr w:type="spellStart"/>
-      <w:r>
-        <w:t>ngẫu</w:t>
-      </w:r>
-      <w:proofErr w:type="spellEnd"/>
-      <w:r>
-        <w:t xml:space="preserve"> </w:t>
-      </w:r>
-      <w:proofErr w:type="spellStart"/>
-      <w:r>
-        <w:t>nhiên</w:t>
-      </w:r>
-      <w:proofErr w:type="spellEnd"/>
-      <w:r>
-        <w:t xml:space="preserve"> (seed 42), </w:t>
-      </w:r>
-      <w:proofErr w:type="spellStart"/>
-      <w:r>
-        <w:t>rồi</w:t>
-      </w:r>
-      <w:proofErr w:type="spellEnd"/>
-      <w:r>
-        <w:t xml:space="preserve"> </w:t>
-      </w:r>
-      <w:proofErr w:type="spellStart"/>
-      <w:r>
-        <w:t>lấy</w:t>
-      </w:r>
-      <w:proofErr w:type="spellEnd"/>
-      <w:r>
-        <w:t xml:space="preserve"> 100 </w:t>
-      </w:r>
-      <w:proofErr w:type="spellStart"/>
-      <w:r>
-        <w:t>câu</w:t>
-      </w:r>
-      <w:proofErr w:type="spellEnd"/>
-      <w:r>
-        <w:t xml:space="preserve"> </w:t>
-      </w:r>
-      <w:proofErr w:type="spellStart"/>
-      <w:r>
-        <w:t>hỏi</w:t>
-      </w:r>
-      <w:proofErr w:type="spellEnd"/>
-      <w:r>
-        <w:t xml:space="preserve"> </w:t>
-      </w:r>
-      <w:proofErr w:type="spellStart"/>
-      <w:r>
-        <w:t>liên</w:t>
-      </w:r>
-      <w:proofErr w:type="spellEnd"/>
-      <w:r>
-        <w:t xml:space="preserve"> </w:t>
-      </w:r>
-      <w:proofErr w:type="spellStart"/>
-      <w:r>
-        <w:t>tiếp</w:t>
-      </w:r>
-      <w:proofErr w:type="spellEnd"/>
-      <w:r>
-        <w:t xml:space="preserve"> </w:t>
-      </w:r>
-      <w:proofErr w:type="spellStart"/>
-      <w:r>
-        <w:t>theo</w:t>
-      </w:r>
-      <w:proofErr w:type="spellEnd"/>
-      <w:r>
-        <w:t xml:space="preserve"> </w:t>
-      </w:r>
-      <w:proofErr w:type="spellStart"/>
-      <w:r>
-        <w:t>thời</w:t>
-      </w:r>
-      <w:proofErr w:type="spellEnd"/>
-      <w:r>
-        <w:t xml:space="preserve"> </w:t>
-      </w:r>
-      <w:proofErr w:type="spellStart"/>
-      <w:r>
-        <w:t>gian</w:t>
-      </w:r>
-      <w:proofErr w:type="spellEnd"/>
-      <w:r>
-        <w:t xml:space="preserve"> </w:t>
-      </w:r>
-      <w:proofErr w:type="spellStart"/>
-      <w:r>
-        <w:t>đăng</w:t>
-      </w:r>
-      <w:proofErr w:type="spellEnd"/>
-      <w:r>
-        <w:t xml:space="preserve">. </w:t>
-      </w:r>
-      <w:proofErr w:type="spellStart"/>
-      <w:r>
-        <w:t>Đây</w:t>
-      </w:r>
-      <w:proofErr w:type="spellEnd"/>
-      <w:r>
-        <w:t xml:space="preserve"> </w:t>
-      </w:r>
-      <w:proofErr w:type="spellStart"/>
-      <w:r>
-        <w:t>là</w:t>
-      </w:r>
-      <w:proofErr w:type="spellEnd"/>
-      <w:r>
-        <w:t xml:space="preserve"> </w:t>
-      </w:r>
-      <w:proofErr w:type="spellStart"/>
-      <w:r>
-        <w:t>mẫu</w:t>
-      </w:r>
-      <w:proofErr w:type="spellEnd"/>
-      <w:r>
-        <w:t xml:space="preserve"> </w:t>
-      </w:r>
-      <w:proofErr w:type="spellStart"/>
-      <w:r>
-        <w:t>theo</w:t>
-      </w:r>
-      <w:proofErr w:type="spellEnd"/>
-      <w:r>
-        <w:t xml:space="preserve"> </w:t>
-      </w:r>
-      <w:proofErr w:type="spellStart"/>
-      <w:r>
-        <w:t>cụm</w:t>
-      </w:r>
-      <w:proofErr w:type="spellEnd"/>
-      <w:r>
-        <w:t xml:space="preserve"> </w:t>
-      </w:r>
-      <w:proofErr w:type="spellStart"/>
-      <w:r>
-        <w:t>thời</w:t>
-      </w:r>
-      <w:proofErr w:type="spellEnd"/>
-      <w:r>
-        <w:t xml:space="preserve"> </w:t>
-      </w:r>
-      <w:proofErr w:type="spellStart"/>
-      <w:r>
-        <w:t>gian</w:t>
-      </w:r>
-      <w:proofErr w:type="spellEnd"/>
-      <w:r>
-        <w:t xml:space="preserve">, </w:t>
-      </w:r>
-      <w:proofErr w:type="spellStart"/>
-      <w:r>
-        <w:t>không</w:t>
-      </w:r>
-      <w:proofErr w:type="spellEnd"/>
-      <w:r>
-        <w:t xml:space="preserve"> </w:t>
-      </w:r>
-      <w:proofErr w:type="spellStart"/>
-      <w:r>
-        <w:t>phải</w:t>
-      </w:r>
-      <w:proofErr w:type="spellEnd"/>
-      <w:r>
-        <w:t xml:space="preserve"> 100 </w:t>
-      </w:r>
-      <w:proofErr w:type="spellStart"/>
-      <w:r>
-        <w:t>câu</w:t>
-      </w:r>
-      <w:proofErr w:type="spellEnd"/>
-      <w:r>
-        <w:t xml:space="preserve"> </w:t>
-      </w:r>
-      <w:proofErr w:type="spellStart"/>
-      <w:r>
-        <w:t>hỏi</w:t>
-      </w:r>
-      <w:proofErr w:type="spellEnd"/>
-      <w:r>
-        <w:t xml:space="preserve"> </w:t>
-      </w:r>
-      <w:proofErr w:type="spellStart"/>
-      <w:r>
-        <w:t>được</w:t>
-      </w:r>
-      <w:proofErr w:type="spellEnd"/>
-      <w:r>
-        <w:t xml:space="preserve"> </w:t>
-      </w:r>
-      <w:proofErr w:type="spellStart"/>
-      <w:r>
-        <w:t>chọn</w:t>
-      </w:r>
-      <w:proofErr w:type="spellEnd"/>
-      <w:r>
-        <w:t xml:space="preserve"> </w:t>
-      </w:r>
-      <w:proofErr w:type="spellStart"/>
-      <w:r>
-        <w:t>độc</w:t>
-      </w:r>
-      <w:proofErr w:type="spellEnd"/>
-      <w:r>
-        <w:t xml:space="preserve"> </w:t>
-      </w:r>
-      <w:proofErr w:type="spellStart"/>
-      <w:r>
-        <w:t>lập</w:t>
-      </w:r>
-      <w:proofErr w:type="spellEnd"/>
-      <w:r>
-        <w:t xml:space="preserve"> </w:t>
-      </w:r>
-      <w:proofErr w:type="spellStart"/>
-      <w:r>
-        <w:t>từ</w:t>
-      </w:r>
-      <w:proofErr w:type="spellEnd"/>
-      <w:r>
-        <w:t xml:space="preserve"> </w:t>
-      </w:r>
-      <w:proofErr w:type="spellStart"/>
-      <w:r>
-        <w:t>toàn</w:t>
-      </w:r>
-      <w:proofErr w:type="spellEnd"/>
-      <w:r>
-        <w:t xml:space="preserve"> </w:t>
-      </w:r>
-      <w:proofErr w:type="spellStart"/>
-      <w:r>
-        <w:t>tháng</w:t>
-      </w:r>
-      <w:proofErr w:type="spellEnd"/>
-      <w:r>
-        <w:t xml:space="preserve">. Các tag </w:t>
-      </w:r>
-      <w:proofErr w:type="spellStart"/>
-      <w:r>
-        <w:t>được</w:t>
-      </w:r>
-      <w:proofErr w:type="spellEnd"/>
-      <w:r>
-        <w:t xml:space="preserve"> </w:t>
-      </w:r>
-      <w:proofErr w:type="spellStart"/>
-      <w:r>
-        <w:t>chọn</w:t>
-      </w:r>
-      <w:proofErr w:type="spellEnd"/>
-      <w:r>
-        <w:t xml:space="preserve"> </w:t>
-      </w:r>
-      <w:proofErr w:type="spellStart"/>
-      <w:r>
-        <w:t>làm</w:t>
-      </w:r>
-      <w:proofErr w:type="spellEnd"/>
-      <w:r>
-        <w:t xml:space="preserve"> </w:t>
-      </w:r>
-      <w:proofErr w:type="spellStart"/>
-      <w:r>
-        <w:t>ứng</w:t>
-      </w:r>
-      <w:proofErr w:type="spellEnd"/>
-      <w:r>
-        <w:t xml:space="preserve"> </w:t>
-      </w:r>
-      <w:proofErr w:type="spellStart"/>
-      <w:r>
-        <w:t>viên</w:t>
-      </w:r>
-      <w:proofErr w:type="spellEnd"/>
-      <w:r>
-        <w:t xml:space="preserve"> </w:t>
-      </w:r>
-      <w:proofErr w:type="spellStart"/>
-      <w:r>
-        <w:t>từ</w:t>
-      </w:r>
-      <w:proofErr w:type="spellEnd"/>
-      <w:r>
-        <w:t xml:space="preserve"> </w:t>
-      </w:r>
-      <w:proofErr w:type="spellStart"/>
-      <w:r>
-        <w:t>mẫu</w:t>
-      </w:r>
-      <w:proofErr w:type="spellEnd"/>
-      <w:r>
-        <w:t xml:space="preserve">, </w:t>
-      </w:r>
-      <w:proofErr w:type="spellStart"/>
-      <w:r>
-        <w:t>sau</w:t>
-      </w:r>
-      <w:proofErr w:type="spellEnd"/>
-      <w:r>
-        <w:t xml:space="preserve"> </w:t>
-      </w:r>
-      <w:proofErr w:type="spellStart"/>
-      <w:r>
-        <w:t>đó</w:t>
-      </w:r>
-      <w:proofErr w:type="spellEnd"/>
-      <w:r>
-        <w:t xml:space="preserve"> </w:t>
-      </w:r>
-      <w:proofErr w:type="spellStart"/>
-      <w:r>
-        <w:t>truy</w:t>
-      </w:r>
-      <w:proofErr w:type="spellEnd"/>
-      <w:r>
-        <w:t xml:space="preserve"> </w:t>
-      </w:r>
-      <w:proofErr w:type="spellStart"/>
-      <w:r>
-        <w:t>vấn</w:t>
-      </w:r>
-      <w:proofErr w:type="spellEnd"/>
-      <w:r>
-        <w:t xml:space="preserve"> API </w:t>
-      </w:r>
-      <w:proofErr w:type="spellStart"/>
-      <w:r>
-        <w:t>để</w:t>
-      </w:r>
-      <w:proofErr w:type="spellEnd"/>
-      <w:r>
-        <w:t xml:space="preserve"> </w:t>
-      </w:r>
-      <w:proofErr w:type="spellStart"/>
-      <w:r>
-        <w:t>lấy</w:t>
-      </w:r>
-      <w:proofErr w:type="spellEnd"/>
-      <w:r>
-        <w:t xml:space="preserve"> </w:t>
-      </w:r>
-      <w:proofErr w:type="spellStart"/>
-      <w:r>
-        <w:t>số</w:t>
-      </w:r>
-      <w:proofErr w:type="spellEnd"/>
-      <w:r>
-        <w:t xml:space="preserve"> </w:t>
-      </w:r>
-      <w:proofErr w:type="spellStart"/>
-      <w:r>
-        <w:t>câu</w:t>
-      </w:r>
-      <w:proofErr w:type="spellEnd"/>
-      <w:r>
-        <w:t xml:space="preserve"> </w:t>
-      </w:r>
-      <w:proofErr w:type="spellStart"/>
-      <w:r>
-        <w:t>hỏi</w:t>
-      </w:r>
-      <w:proofErr w:type="spellEnd"/>
-      <w:r>
-        <w:t xml:space="preserve"> </w:t>
-      </w:r>
-      <w:proofErr w:type="spellStart"/>
-      <w:r>
-        <w:t>của</w:t>
-      </w:r>
-      <w:proofErr w:type="spellEnd"/>
-      <w:r>
-        <w:t xml:space="preserve"> </w:t>
-      </w:r>
-      <w:proofErr w:type="spellStart"/>
-      <w:r>
-        <w:t>từng</w:t>
-      </w:r>
-      <w:proofErr w:type="spellEnd"/>
-      <w:r>
-        <w:t xml:space="preserve"> tag </w:t>
-      </w:r>
-      <w:proofErr w:type="spellStart"/>
-      <w:r>
-        <w:t>trong</w:t>
-      </w:r>
-      <w:proofErr w:type="spellEnd"/>
-      <w:r>
-        <w:t xml:space="preserve"> </w:t>
-      </w:r>
-      <w:proofErr w:type="spellStart"/>
-      <w:r>
-        <w:t>mỗi</w:t>
-      </w:r>
-      <w:proofErr w:type="spellEnd"/>
-      <w:r>
-        <w:t xml:space="preserve"> </w:t>
-      </w:r>
-      <w:proofErr w:type="spellStart"/>
-      <w:r>
-        <w:t>giai</w:t>
-      </w:r>
-      <w:proofErr w:type="spellEnd"/>
-      <w:r>
-        <w:t xml:space="preserve"> </w:t>
-      </w:r>
-      <w:proofErr w:type="spellStart"/>
-      <w:r>
-        <w:t>đoạn</w:t>
-      </w:r>
-      <w:proofErr w:type="spellEnd"/>
-      <w:r>
-        <w:t>.</w:t>
+      <w:r>
+        <w:rPr>
+          <w:b/>
+        </w:rPr>
+        <w:t xml:space="preserve">so_monthly_totals.csv (60 dòng × 3 cột). </w:t>
+      </w:r>
+      <w:r>
+        <w:t>Mỗi dòng là một tháng từ 01/2021 đến 12/2025. Month (chuỗi YYYY-MM) xác định tháng; Questions và Answers (số nguyên) lần lượt đếm câu hỏi và câu trả lời đăng trong tháng. Nhóm truy vấn /questions và /answers để lấy số đếm theo tháng. Tệp có đủ 60 tháng, không trùng Month và không có giá trị khuyết; tổng cộng 4.165.547 câu hỏi và 5.486.140 câu trả lời.</w:t>
       </w:r>
     </w:p>
     <w:p>
@@ -1455,7 +728,22 @@
         <w:pStyle w:val="BT"/>
       </w:pPr>
       <w:r>
-        <w:t>Trong so_tag_counts.csv, Tag (chuỗi) là tên nhãn; Period (Before/After) là giai đoạn; Questions (số nguyên) đếm câu hỏi gắn nhãn; Months (số nguyên) là 23 hoặc 37 tháng; Group (chuỗi) phân loại Programming hoặc AI/LLM. Mỗi cặp Tag–Period là duy nhất và cả năm cột không khuyết. Ba bảng có đơn vị quan sát khác nhau: số bài đăng toàn trang theo tháng, thuộc tính của câu hỏi mẫu, và số câu hỏi theo tag trong giai đoạn. Chỉ số cấp câu hỏi là ước lượng từ mẫu; một câu hỏi có thể mang nhiều tag.</w:t>
+        <w:rPr>
+          <w:b/>
+        </w:rPr>
+        <w:t xml:space="preserve">so_questions_sample.csv (6.000 dòng × 13 cột). </w:t>
+      </w:r>
+      <w:r>
+        <w:t>Mỗi dòng là một câu hỏi; nhóm lấy 100 câu hỏi trong mỗi tháng. Từ một thời điểm bắt đầu được chọn bằng bộ sinh số giả ngẫu nhiên (seed 42), nhóm lấy 100 câu hỏi liên tiếp theo thời gian đăng. Đây là mẫu theo cụm thời gian, không phải các câu hỏi được chọn độc lập trong cả tháng. Bảng 1 giải thích đủ 13 cột: 10 cột lấy từ API và ba cột tính thêm (Month, Period, HasAccepted).</w:t>
+      </w:r>
+    </w:p>
+    <w:p>
+      <w:pPr>
+        <w:pStyle w:val="BT"/>
+        <w:jc w:val="center"/>
+      </w:pPr>
+      <w:r>
+        <w:t>Bảng 1. Mười ba cột của so_questions_sample.csv; (*) là cột tính thêm</w:t>
       </w:r>
     </w:p>
     <w:tbl>
@@ -3596,7 +2884,7 @@
               <w:rPr>
                 <w:sz w:val="21"/>
               </w:rPr>
-              <w:t>Before/After</w:t>
+              <w:t>Before AI/After AI</w:t>
             </w:r>
           </w:p>
         </w:tc>
@@ -3819,191 +3107,23 @@
     <w:p>
       <w:pPr>
         <w:pStyle w:val="BT"/>
-        <w:jc w:val="center"/>
-      </w:pPr>
-      <w:proofErr w:type="spellStart"/>
-      <w:r>
-        <w:rPr>
-          <w:i/>
-        </w:rPr>
-        <w:t>Bảng</w:t>
-      </w:r>
-      <w:proofErr w:type="spellEnd"/>
-      <w:r>
-        <w:rPr>
-          <w:i/>
-        </w:rPr>
-        <w:t xml:space="preserve"> 1. </w:t>
-      </w:r>
-      <w:proofErr w:type="spellStart"/>
-      <w:r>
-        <w:rPr>
-          <w:i/>
-        </w:rPr>
-        <w:t>Mười</w:t>
-      </w:r>
-      <w:proofErr w:type="spellEnd"/>
-      <w:r>
-        <w:rPr>
-          <w:i/>
-        </w:rPr>
-        <w:t xml:space="preserve"> </w:t>
-      </w:r>
-      <w:proofErr w:type="spellStart"/>
-      <w:r>
-        <w:rPr>
-          <w:i/>
-        </w:rPr>
-        <w:t>ba</w:t>
-      </w:r>
-      <w:proofErr w:type="spellEnd"/>
-      <w:r>
-        <w:rPr>
-          <w:i/>
-        </w:rPr>
-        <w:t xml:space="preserve"> </w:t>
-      </w:r>
-      <w:proofErr w:type="spellStart"/>
-      <w:r>
-        <w:rPr>
-          <w:i/>
-        </w:rPr>
-        <w:t>cột</w:t>
-      </w:r>
-      <w:proofErr w:type="spellEnd"/>
-      <w:r>
-        <w:rPr>
-          <w:i/>
-        </w:rPr>
-        <w:t xml:space="preserve"> </w:t>
-      </w:r>
-      <w:proofErr w:type="spellStart"/>
-      <w:r>
-        <w:rPr>
-          <w:i/>
-        </w:rPr>
-        <w:t>của</w:t>
-      </w:r>
-      <w:proofErr w:type="spellEnd"/>
-      <w:r>
-        <w:rPr>
-          <w:i/>
-        </w:rPr>
-        <w:t xml:space="preserve"> </w:t>
-      </w:r>
-      <w:proofErr w:type="spellStart"/>
-      <w:r>
-        <w:rPr>
-          <w:i/>
-        </w:rPr>
-        <w:t>bảng</w:t>
-      </w:r>
-      <w:proofErr w:type="spellEnd"/>
-      <w:r>
-        <w:rPr>
-          <w:i/>
-        </w:rPr>
-        <w:t xml:space="preserve"> </w:t>
-      </w:r>
-      <w:proofErr w:type="spellStart"/>
-      <w:r>
-        <w:rPr>
-          <w:i/>
-        </w:rPr>
-        <w:t>câu</w:t>
-      </w:r>
-      <w:proofErr w:type="spellEnd"/>
-      <w:r>
-        <w:rPr>
-          <w:i/>
-        </w:rPr>
-        <w:t xml:space="preserve"> </w:t>
-      </w:r>
-      <w:proofErr w:type="spellStart"/>
-      <w:r>
-        <w:rPr>
-          <w:i/>
-        </w:rPr>
-        <w:t>hỏi</w:t>
-      </w:r>
-      <w:proofErr w:type="spellEnd"/>
-      <w:r>
-        <w:rPr>
-          <w:i/>
-        </w:rPr>
-        <w:t xml:space="preserve"> </w:t>
-      </w:r>
-      <w:proofErr w:type="spellStart"/>
-      <w:r>
-        <w:rPr>
-          <w:i/>
-        </w:rPr>
-        <w:t>mẫu</w:t>
-      </w:r>
-      <w:proofErr w:type="spellEnd"/>
-      <w:r>
-        <w:rPr>
-          <w:i/>
-        </w:rPr>
-        <w:t xml:space="preserve">; (*) </w:t>
-      </w:r>
-      <w:proofErr w:type="spellStart"/>
-      <w:r>
-        <w:rPr>
-          <w:i/>
-        </w:rPr>
-        <w:t>là</w:t>
-      </w:r>
-      <w:proofErr w:type="spellEnd"/>
-      <w:r>
-        <w:rPr>
-          <w:i/>
-        </w:rPr>
-        <w:t xml:space="preserve"> </w:t>
-      </w:r>
-      <w:proofErr w:type="spellStart"/>
-      <w:r>
-        <w:rPr>
-          <w:i/>
-        </w:rPr>
-        <w:t>cột</w:t>
-      </w:r>
-      <w:proofErr w:type="spellEnd"/>
-      <w:r>
-        <w:rPr>
-          <w:i/>
-        </w:rPr>
-        <w:t xml:space="preserve"> </w:t>
-      </w:r>
-      <w:proofErr w:type="spellStart"/>
-      <w:r>
-        <w:rPr>
-          <w:i/>
-        </w:rPr>
-        <w:t>tính</w:t>
-      </w:r>
-      <w:proofErr w:type="spellEnd"/>
-      <w:r>
-        <w:rPr>
-          <w:i/>
-        </w:rPr>
-        <w:t xml:space="preserve"> </w:t>
-      </w:r>
-      <w:proofErr w:type="spellStart"/>
-      <w:r>
-        <w:rPr>
-          <w:i/>
-        </w:rPr>
-        <w:t>thêm</w:t>
-      </w:r>
-      <w:proofErr w:type="spellEnd"/>
+      </w:pPr>
+      <w:r>
+        <w:t>Kiểm tra ban đầu cho thấy 6.000 câu hỏi mẫu đều có PostTypeId = 1, không trùng Id và không thiếu CreationDate, Score, AnswerCount hay Tags. Có 3.695 giá trị AcceptedAnswerId trống (61,6%) và 5.674 giá trị ClosedDate trống; hai trường này có thể khuyết theo trạng thái câu hỏi. Month được trích từ CreationDate, Period chia trước và sau tháng 12/2022, còn HasAccepted cho biết AcceptedAnswerId có giá trị.</w:t>
+      </w:r>
     </w:p>
     <w:p>
       <w:pPr>
         <w:pStyle w:val="BT"/>
       </w:pPr>
       <w:r>
-        <w:t>Kiểm tra ban đầu cho thấy 6.000 câu hỏi mẫu đều có PostTypeId = 1, không trùng Id và không thiếu CreationDate, Score, AnswerCount hay Tags. Có 3.695 giá trị AcceptedAnswerId trống (61,6%) và 5.674 giá trị ClosedDate trống; hai trường này có thể khuyết theo trạng thái câu hỏi. Month được trích từ CreationDate, Period chia trước và sau tháng 12/2022, còn HasAccepted cho biết AcceptedAnswerId có giá trị.</w:t>
+        <w:rPr>
+          <w:b/>
+        </w:rPr>
+        <w:t xml:space="preserve">so_tag_counts.csv (62 dòng × 5 cột). </w:t>
+      </w:r>
+      <w:r>
+        <w:t>Mỗi dòng là một cặp tag–giai đoạn. Tệp gồm 31 tag được theo dõi ở hai giai đoạn: 25 tag lập trình và sáu tag AI/LLM. Tag (chuỗi) là tên nhãn; Period (chuỗi) là Before hoặc After; Questions (số nguyên) đếm câu hỏi gắn nhãn; Months (số nguyên) là 23 hoặc 37 tháng; Group (chuỗi) phân loại Programming hoặc AI/LLM. Nhóm chọn các tag ứng viên từ mẫu rồi truy vấn API để đếm câu hỏi theo tag và giai đoạn. Tệp không có giá trị khuyết, mỗi cặp Tag–Period là duy nhất; một câu hỏi có thể mang nhiều tag.</w:t>
       </w:r>
     </w:p>
     <w:p>

</xml_diff>

<commit_message>
Add column tables for all submitted CSV datasets
</commit_message>
<xml_diff>
--- a/Nhom6_Bao_cao.docx
+++ b/Nhom6_Bao_cao.docx
@@ -720,30 +720,16 @@
         <w:t xml:space="preserve">so_monthly_totals.csv (60 dòng × 3 cột). </w:t>
       </w:r>
       <w:r>
-        <w:t>Mỗi dòng là một tháng từ 01/2021 đến 12/2025. Month (chuỗi YYYY-MM) xác định tháng; Questions và Answers (số nguyên) lần lượt đếm câu hỏi và câu trả lời đăng trong tháng. Nhóm truy vấn /questions và /answers để lấy số đếm theo tháng. Tệp có đủ 60 tháng, không trùng Month và không có giá trị khuyết; tổng cộng 4.165.547 câu hỏi và 5.486.140 câu trả lời.</w:t>
+        <w:t>Mỗi dòng là một tháng từ 01/2021 đến 12/2025. Nhóm truy vấn /questions và /answers để lấy số bài đăng theo tháng. Tệp có đủ 60 tháng, không trùng tháng và không có giá trị khuyết; tổng cộng 4.165.547 câu hỏi và 5.486.140 câu trả lời. Bảng 1 giải thích ba cột của tệp.</w:t>
       </w:r>
     </w:p>
     <w:p>
       <w:pPr>
         <w:pStyle w:val="BT"/>
-      </w:pPr>
-      <w:r>
-        <w:rPr>
-          <w:b/>
-        </w:rPr>
-        <w:t xml:space="preserve">so_questions_sample.csv (6.000 dòng × 13 cột). </w:t>
-      </w:r>
-      <w:r>
-        <w:t>Mỗi dòng là một câu hỏi; nhóm lấy 100 câu hỏi trong mỗi tháng. Từ một thời điểm bắt đầu được chọn bằng bộ sinh số giả ngẫu nhiên (seed 42), nhóm lấy 100 câu hỏi liên tiếp theo thời gian đăng. Đây là mẫu theo cụm thời gian, không phải các câu hỏi được chọn độc lập trong cả tháng. Bảng 1 giải thích đủ 13 cột: 10 cột lấy từ API và ba cột tính thêm (Month, Period, HasAccepted).</w:t>
-      </w:r>
-    </w:p>
-    <w:p>
-      <w:pPr>
-        <w:pStyle w:val="BT"/>
         <w:jc w:val="center"/>
       </w:pPr>
       <w:r>
-        <w:t>Bảng 1. Mười ba cột của so_questions_sample.csv; (*) là cột tính thêm</w:t>
+        <w:t>Bảng 1. Ba cột của so_monthly_totals.csv</w:t>
       </w:r>
     </w:p>
     <w:tbl>
@@ -957,6 +943,665 @@
               <w:rPr>
                 <w:sz w:val="21"/>
               </w:rPr>
+              <w:t>Month</w:t>
+            </w:r>
+          </w:p>
+        </w:tc>
+        <w:tc>
+          <w:tcPr>
+            <w:tcW w:w="1417" w:type="dxa"/>
+          </w:tcPr>
+          <w:p>
+            <w:pPr>
+              <w:spacing w:after="0" w:line="240" w:lineRule="auto"/>
+              <w:jc w:val="left"/>
+            </w:pPr>
+            <w:proofErr w:type="spellStart"/>
+            <w:r>
+              <w:rPr>
+                <w:sz w:val="21"/>
+              </w:rPr>
+              <w:t>Chuỗi</w:t>
+            </w:r>
+            <w:proofErr w:type="spellEnd"/>
+            <w:r>
+              <w:rPr>
+                <w:sz w:val="21"/>
+              </w:rPr>
+            </w:r>
+            <w:proofErr w:type="spellStart"/>
+            <w:r>
+              <w:rPr>
+                <w:sz w:val="21"/>
+              </w:rPr>
+            </w:r>
+            <w:proofErr w:type="spellEnd"/>
+          </w:p>
+        </w:tc>
+        <w:tc>
+          <w:tcPr>
+            <w:tcW w:w="1587" w:type="dxa"/>
+          </w:tcPr>
+          <w:p>
+            <w:pPr>
+              <w:spacing w:after="0" w:line="240" w:lineRule="auto"/>
+              <w:jc w:val="left"/>
+            </w:pPr>
+            <w:r>
+              <w:rPr>
+                <w:sz w:val="21"/>
+              </w:rPr>
+              <w:t>2021-01–2025-12</w:t>
+            </w:r>
+            <w:proofErr w:type="spellStart"/>
+            <w:r>
+              <w:rPr>
+                <w:sz w:val="21"/>
+              </w:rPr>
+            </w:r>
+            <w:proofErr w:type="spellEnd"/>
+          </w:p>
+        </w:tc>
+        <w:tc>
+          <w:tcPr>
+            <w:tcW w:w="3175" w:type="dxa"/>
+          </w:tcPr>
+          <w:p>
+            <w:pPr>
+              <w:spacing w:after="0" w:line="240" w:lineRule="auto"/>
+              <w:jc w:val="left"/>
+            </w:pPr>
+            <w:proofErr w:type="spellStart"/>
+            <w:r>
+              <w:rPr>
+                <w:sz w:val="21"/>
+              </w:rPr>
+              <w:t>Tháng đăng bài (UTC).</w:t>
+            </w:r>
+            <w:proofErr w:type="spellEnd"/>
+            <w:r>
+              <w:rPr>
+                <w:sz w:val="21"/>
+              </w:rPr>
+            </w:r>
+            <w:proofErr w:type="spellStart"/>
+            <w:r>
+              <w:rPr>
+                <w:sz w:val="21"/>
+              </w:rPr>
+            </w:r>
+            <w:proofErr w:type="spellEnd"/>
+            <w:r>
+              <w:rPr>
+                <w:sz w:val="21"/>
+              </w:rPr>
+            </w:r>
+            <w:proofErr w:type="spellStart"/>
+            <w:r>
+              <w:rPr>
+                <w:sz w:val="21"/>
+              </w:rPr>
+            </w:r>
+            <w:proofErr w:type="spellEnd"/>
+            <w:r>
+              <w:rPr>
+                <w:sz w:val="21"/>
+              </w:rPr>
+            </w:r>
+            <w:proofErr w:type="spellStart"/>
+            <w:r>
+              <w:rPr>
+                <w:sz w:val="21"/>
+              </w:rPr>
+            </w:r>
+            <w:proofErr w:type="spellEnd"/>
+            <w:r>
+              <w:rPr>
+                <w:sz w:val="21"/>
+              </w:rPr>
+            </w:r>
+          </w:p>
+        </w:tc>
+      </w:tr>
+      <w:tr>
+        <w:tc>
+          <w:tcPr>
+            <w:tcW w:w="680" w:type="dxa"/>
+          </w:tcPr>
+          <w:p>
+            <w:pPr>
+              <w:spacing w:after="0" w:line="240" w:lineRule="auto"/>
+              <w:jc w:val="left"/>
+            </w:pPr>
+            <w:r>
+              <w:rPr>
+                <w:sz w:val="21"/>
+              </w:rPr>
+              <w:t>2</w:t>
+            </w:r>
+          </w:p>
+        </w:tc>
+        <w:tc>
+          <w:tcPr>
+            <w:tcW w:w="2041" w:type="dxa"/>
+          </w:tcPr>
+          <w:p>
+            <w:pPr>
+              <w:spacing w:after="0" w:line="240" w:lineRule="auto"/>
+              <w:jc w:val="left"/>
+            </w:pPr>
+            <w:proofErr w:type="spellStart"/>
+            <w:r>
+              <w:rPr>
+                <w:sz w:val="21"/>
+              </w:rPr>
+              <w:t>Questions</w:t>
+            </w:r>
+            <w:proofErr w:type="spellEnd"/>
+          </w:p>
+        </w:tc>
+        <w:tc>
+          <w:tcPr>
+            <w:tcW w:w="1417" w:type="dxa"/>
+          </w:tcPr>
+          <w:p>
+            <w:pPr>
+              <w:spacing w:after="0" w:line="240" w:lineRule="auto"/>
+              <w:jc w:val="left"/>
+            </w:pPr>
+            <w:proofErr w:type="spellStart"/>
+            <w:r>
+              <w:rPr>
+                <w:sz w:val="21"/>
+              </w:rPr>
+              <w:t>Số nguyên</w:t>
+            </w:r>
+            <w:proofErr w:type="spellEnd"/>
+            <w:r>
+              <w:rPr>
+                <w:sz w:val="21"/>
+              </w:rPr>
+            </w:r>
+            <w:proofErr w:type="spellStart"/>
+            <w:r>
+              <w:rPr>
+                <w:sz w:val="21"/>
+              </w:rPr>
+            </w:r>
+            <w:proofErr w:type="spellEnd"/>
+          </w:p>
+        </w:tc>
+        <w:tc>
+          <w:tcPr>
+            <w:tcW w:w="1587" w:type="dxa"/>
+          </w:tcPr>
+          <w:p>
+            <w:pPr>
+              <w:spacing w:after="0" w:line="240" w:lineRule="auto"/>
+              <w:jc w:val="left"/>
+            </w:pPr>
+            <w:r>
+              <w:rPr>
+                <w:sz w:val="21"/>
+              </w:rPr>
+              <w:t>4.195–148.706</w:t>
+            </w:r>
+          </w:p>
+        </w:tc>
+        <w:tc>
+          <w:tcPr>
+            <w:tcW w:w="3175" w:type="dxa"/>
+          </w:tcPr>
+          <w:p>
+            <w:pPr>
+              <w:spacing w:after="0" w:line="240" w:lineRule="auto"/>
+              <w:jc w:val="left"/>
+            </w:pPr>
+            <w:proofErr w:type="spellStart"/>
+            <w:r>
+              <w:rPr>
+                <w:sz w:val="21"/>
+              </w:rPr>
+              <w:t>Số câu hỏi đăng trong tháng.</w:t>
+            </w:r>
+            <w:proofErr w:type="spellEnd"/>
+            <w:r>
+              <w:rPr>
+                <w:sz w:val="21"/>
+              </w:rPr>
+            </w:r>
+            <w:proofErr w:type="spellStart"/>
+            <w:r>
+              <w:rPr>
+                <w:sz w:val="21"/>
+              </w:rPr>
+            </w:r>
+            <w:proofErr w:type="spellEnd"/>
+            <w:r>
+              <w:rPr>
+                <w:sz w:val="21"/>
+              </w:rPr>
+            </w:r>
+            <w:proofErr w:type="spellStart"/>
+            <w:r>
+              <w:rPr>
+                <w:sz w:val="21"/>
+              </w:rPr>
+            </w:r>
+            <w:proofErr w:type="spellEnd"/>
+            <w:r>
+              <w:rPr>
+                <w:sz w:val="21"/>
+              </w:rPr>
+            </w:r>
+            <w:proofErr w:type="spellStart"/>
+            <w:r>
+              <w:rPr>
+                <w:sz w:val="21"/>
+              </w:rPr>
+            </w:r>
+            <w:proofErr w:type="spellEnd"/>
+            <w:r>
+              <w:rPr>
+                <w:sz w:val="21"/>
+              </w:rPr>
+            </w:r>
+          </w:p>
+        </w:tc>
+      </w:tr>
+      <w:tr>
+        <w:tc>
+          <w:tcPr>
+            <w:tcW w:w="680" w:type="dxa"/>
+          </w:tcPr>
+          <w:p>
+            <w:pPr>
+              <w:spacing w:after="0" w:line="240" w:lineRule="auto"/>
+              <w:jc w:val="left"/>
+            </w:pPr>
+            <w:r>
+              <w:rPr>
+                <w:sz w:val="21"/>
+              </w:rPr>
+              <w:t>3</w:t>
+            </w:r>
+          </w:p>
+        </w:tc>
+        <w:tc>
+          <w:tcPr>
+            <w:tcW w:w="2041" w:type="dxa"/>
+          </w:tcPr>
+          <w:p>
+            <w:pPr>
+              <w:spacing w:after="0" w:line="240" w:lineRule="auto"/>
+              <w:jc w:val="left"/>
+            </w:pPr>
+            <w:proofErr w:type="spellStart"/>
+            <w:r>
+              <w:rPr>
+                <w:sz w:val="21"/>
+              </w:rPr>
+              <w:t>Answers</w:t>
+            </w:r>
+            <w:proofErr w:type="spellEnd"/>
+          </w:p>
+        </w:tc>
+        <w:tc>
+          <w:tcPr>
+            <w:tcW w:w="1417" w:type="dxa"/>
+          </w:tcPr>
+          <w:p>
+            <w:pPr>
+              <w:spacing w:after="0" w:line="240" w:lineRule="auto"/>
+              <w:jc w:val="left"/>
+            </w:pPr>
+            <w:proofErr w:type="spellStart"/>
+            <w:r>
+              <w:rPr>
+                <w:sz w:val="21"/>
+              </w:rPr>
+              <w:t>Số nguyên</w:t>
+            </w:r>
+            <w:proofErr w:type="spellEnd"/>
+            <w:r>
+              <w:rPr>
+                <w:sz w:val="21"/>
+              </w:rPr>
+            </w:r>
+            <w:proofErr w:type="spellStart"/>
+            <w:r>
+              <w:rPr>
+                <w:sz w:val="21"/>
+              </w:rPr>
+            </w:r>
+            <w:proofErr w:type="spellEnd"/>
+          </w:p>
+        </w:tc>
+        <w:tc>
+          <w:tcPr>
+            <w:tcW w:w="1587" w:type="dxa"/>
+          </w:tcPr>
+          <w:p>
+            <w:pPr>
+              <w:spacing w:after="0" w:line="240" w:lineRule="auto"/>
+              <w:jc w:val="left"/>
+            </w:pPr>
+            <w:r>
+              <w:rPr>
+                <w:sz w:val="21"/>
+              </w:rPr>
+              <w:t>8.181–188.791</w:t>
+            </w:r>
+          </w:p>
+        </w:tc>
+        <w:tc>
+          <w:tcPr>
+            <w:tcW w:w="3175" w:type="dxa"/>
+          </w:tcPr>
+          <w:p>
+            <w:pPr>
+              <w:spacing w:after="0" w:line="240" w:lineRule="auto"/>
+              <w:jc w:val="left"/>
+            </w:pPr>
+            <w:proofErr w:type="spellStart"/>
+            <w:r>
+              <w:rPr>
+                <w:sz w:val="21"/>
+              </w:rPr>
+              <w:t>Số câu trả lời đăng trong tháng.</w:t>
+            </w:r>
+            <w:proofErr w:type="spellEnd"/>
+            <w:r>
+              <w:rPr>
+                <w:sz w:val="21"/>
+              </w:rPr>
+            </w:r>
+            <w:proofErr w:type="spellStart"/>
+            <w:r>
+              <w:rPr>
+                <w:sz w:val="21"/>
+              </w:rPr>
+            </w:r>
+            <w:proofErr w:type="spellEnd"/>
+            <w:r>
+              <w:rPr>
+                <w:sz w:val="21"/>
+              </w:rPr>
+            </w:r>
+            <w:proofErr w:type="spellStart"/>
+            <w:r>
+              <w:rPr>
+                <w:sz w:val="21"/>
+              </w:rPr>
+            </w:r>
+            <w:proofErr w:type="spellEnd"/>
+            <w:r>
+              <w:rPr>
+                <w:sz w:val="21"/>
+              </w:rPr>
+            </w:r>
+            <w:proofErr w:type="spellStart"/>
+            <w:r>
+              <w:rPr>
+                <w:sz w:val="21"/>
+              </w:rPr>
+            </w:r>
+            <w:proofErr w:type="spellEnd"/>
+            <w:r>
+              <w:rPr>
+                <w:sz w:val="21"/>
+              </w:rPr>
+            </w:r>
+            <w:proofErr w:type="spellStart"/>
+            <w:r>
+              <w:rPr>
+                <w:sz w:val="21"/>
+              </w:rPr>
+            </w:r>
+            <w:proofErr w:type="spellEnd"/>
+            <w:r>
+              <w:rPr>
+                <w:sz w:val="21"/>
+              </w:rPr>
+            </w:r>
+          </w:p>
+        </w:tc>
+      </w:tr>
+    </w:tbl>
+    <w:p>
+      <w:pPr>
+        <w:pStyle w:val="BT"/>
+      </w:pPr>
+      <w:r>
+        <w:rPr>
+          <w:b/>
+        </w:rPr>
+        <w:t xml:space="preserve">so_questions_sample.csv (6.000 dòng × 13 cột). </w:t>
+      </w:r>
+      <w:r>
+        <w:t>Mỗi dòng là một câu hỏi; nhóm lấy 100 câu hỏi trong mỗi tháng. Từ một thời điểm bắt đầu được chọn bằng bộ sinh số giả ngẫu nhiên (seed 42), nhóm lấy 100 câu hỏi liên tiếp theo thời gian đăng. Đây là mẫu theo cụm thời gian, không phải các câu hỏi được chọn độc lập trong cả tháng. Bảng 2 giải thích 10 cột từ API và ba cột tính thêm (Month, Period, HasAccepted).</w:t>
+      </w:r>
+    </w:p>
+    <w:p>
+      <w:pPr>
+        <w:pStyle w:val="BT"/>
+        <w:jc w:val="center"/>
+      </w:pPr>
+      <w:r>
+        <w:t>Bảng 2. Mười ba cột của so_questions_sample.csv; (*) là cột tính thêm</w:t>
+      </w:r>
+    </w:p>
+    <w:tbl>
+      <w:tblPr>
+        <w:tblStyle w:val="new"/>
+        <w:tblW w:w="0" w:type="auto"/>
+        <w:tblLayout w:type="fixed"/>
+        <w:tblLook w:val="04A0" w:firstRow="1" w:lastRow="0" w:firstColumn="1" w:lastColumn="0" w:noHBand="0" w:noVBand="1"/>
+      </w:tblPr>
+      <w:tblGrid>
+        <w:gridCol w:w="680"/>
+        <w:gridCol w:w="2041"/>
+        <w:gridCol w:w="1417"/>
+        <w:gridCol w:w="1587"/>
+        <w:gridCol w:w="3175"/>
+      </w:tblGrid>
+      <w:tr>
+        <w:trPr>
+          <w:cnfStyle w:val="100000000000" w:firstRow="1" w:lastRow="0" w:firstColumn="0" w:lastColumn="0" w:oddVBand="0" w:evenVBand="0" w:oddHBand="0" w:evenHBand="0" w:firstRowFirstColumn="0" w:firstRowLastColumn="0" w:lastRowFirstColumn="0" w:lastRowLastColumn="0"/>
+          <w:tblHeader/>
+        </w:trPr>
+        <w:tc>
+          <w:tcPr>
+            <w:tcW w:w="680" w:type="dxa"/>
+          </w:tcPr>
+          <w:p>
+            <w:pPr>
+              <w:spacing w:after="0" w:line="240" w:lineRule="auto"/>
+              <w:jc w:val="left"/>
+            </w:pPr>
+            <w:r>
+              <w:rPr>
+                <w:color w:val="FF0000"/>
+                <w:sz w:val="21"/>
+              </w:rPr>
+              <w:t>STT</w:t>
+            </w:r>
+          </w:p>
+        </w:tc>
+        <w:tc>
+          <w:tcPr>
+            <w:tcW w:w="2041" w:type="dxa"/>
+          </w:tcPr>
+          <w:p>
+            <w:pPr>
+              <w:spacing w:after="0" w:line="240" w:lineRule="auto"/>
+              <w:jc w:val="left"/>
+            </w:pPr>
+            <w:proofErr w:type="spellStart"/>
+            <w:r>
+              <w:rPr>
+                <w:color w:val="FF0000"/>
+                <w:sz w:val="21"/>
+              </w:rPr>
+              <w:t>Tên</w:t>
+            </w:r>
+            <w:proofErr w:type="spellEnd"/>
+            <w:r>
+              <w:rPr>
+                <w:color w:val="FF0000"/>
+                <w:sz w:val="21"/>
+              </w:rPr>
+              <w:t xml:space="preserve"> </w:t>
+            </w:r>
+            <w:proofErr w:type="spellStart"/>
+            <w:r>
+              <w:rPr>
+                <w:color w:val="FF0000"/>
+                <w:sz w:val="21"/>
+              </w:rPr>
+              <w:t>cột</w:t>
+            </w:r>
+            <w:proofErr w:type="spellEnd"/>
+          </w:p>
+        </w:tc>
+        <w:tc>
+          <w:tcPr>
+            <w:tcW w:w="1417" w:type="dxa"/>
+          </w:tcPr>
+          <w:p>
+            <w:pPr>
+              <w:spacing w:after="0" w:line="240" w:lineRule="auto"/>
+              <w:jc w:val="left"/>
+            </w:pPr>
+            <w:proofErr w:type="spellStart"/>
+            <w:r>
+              <w:rPr>
+                <w:color w:val="FF0000"/>
+                <w:sz w:val="21"/>
+              </w:rPr>
+              <w:t>Kiểu</w:t>
+            </w:r>
+            <w:proofErr w:type="spellEnd"/>
+            <w:r>
+              <w:rPr>
+                <w:color w:val="FF0000"/>
+                <w:sz w:val="21"/>
+              </w:rPr>
+              <w:t xml:space="preserve"> </w:t>
+            </w:r>
+            <w:proofErr w:type="spellStart"/>
+            <w:r>
+              <w:rPr>
+                <w:color w:val="FF0000"/>
+                <w:sz w:val="21"/>
+              </w:rPr>
+              <w:t>dữ</w:t>
+            </w:r>
+            <w:proofErr w:type="spellEnd"/>
+            <w:r>
+              <w:rPr>
+                <w:color w:val="FF0000"/>
+                <w:sz w:val="21"/>
+              </w:rPr>
+              <w:t xml:space="preserve"> </w:t>
+            </w:r>
+            <w:proofErr w:type="spellStart"/>
+            <w:r>
+              <w:rPr>
+                <w:color w:val="FF0000"/>
+                <w:sz w:val="21"/>
+              </w:rPr>
+              <w:t>liệu</w:t>
+            </w:r>
+            <w:proofErr w:type="spellEnd"/>
+          </w:p>
+        </w:tc>
+        <w:tc>
+          <w:tcPr>
+            <w:tcW w:w="1587" w:type="dxa"/>
+          </w:tcPr>
+          <w:p>
+            <w:pPr>
+              <w:spacing w:after="0" w:line="240" w:lineRule="auto"/>
+              <w:jc w:val="left"/>
+            </w:pPr>
+            <w:r>
+              <w:rPr>
+                <w:color w:val="FF0000"/>
+                <w:sz w:val="21"/>
+              </w:rPr>
+              <w:t>Phạm vi</w:t>
+            </w:r>
+          </w:p>
+        </w:tc>
+        <w:tc>
+          <w:tcPr>
+            <w:tcW w:w="3175" w:type="dxa"/>
+          </w:tcPr>
+          <w:p>
+            <w:pPr>
+              <w:spacing w:after="0" w:line="240" w:lineRule="auto"/>
+              <w:jc w:val="left"/>
+            </w:pPr>
+            <w:proofErr w:type="spellStart"/>
+            <w:r>
+              <w:rPr>
+                <w:color w:val="FF0000"/>
+                <w:sz w:val="21"/>
+              </w:rPr>
+              <w:t>Giải</w:t>
+            </w:r>
+            <w:proofErr w:type="spellEnd"/>
+            <w:r>
+              <w:rPr>
+                <w:color w:val="FF0000"/>
+                <w:sz w:val="21"/>
+              </w:rPr>
+              <w:t xml:space="preserve"> </w:t>
+            </w:r>
+            <w:proofErr w:type="spellStart"/>
+            <w:r>
+              <w:rPr>
+                <w:color w:val="FF0000"/>
+                <w:sz w:val="21"/>
+              </w:rPr>
+              <w:t>thích</w:t>
+            </w:r>
+            <w:proofErr w:type="spellEnd"/>
+          </w:p>
+        </w:tc>
+      </w:tr>
+      <w:tr>
+        <w:tc>
+          <w:tcPr>
+            <w:tcW w:w="680" w:type="dxa"/>
+          </w:tcPr>
+          <w:p>
+            <w:pPr>
+              <w:spacing w:after="0" w:line="240" w:lineRule="auto"/>
+              <w:jc w:val="left"/>
+            </w:pPr>
+            <w:r>
+              <w:rPr>
+                <w:sz w:val="21"/>
+              </w:rPr>
+              <w:t>1</w:t>
+            </w:r>
+          </w:p>
+        </w:tc>
+        <w:tc>
+          <w:tcPr>
+            <w:tcW w:w="2041" w:type="dxa"/>
+          </w:tcPr>
+          <w:p>
+            <w:pPr>
+              <w:spacing w:after="0" w:line="240" w:lineRule="auto"/>
+              <w:jc w:val="left"/>
+            </w:pPr>
+            <w:r>
+              <w:rPr>
+                <w:sz w:val="21"/>
+              </w:rPr>
               <w:t>Id</w:t>
             </w:r>
           </w:p>
@@ -3123,12 +3768,972 @@
         <w:t xml:space="preserve">so_tag_counts.csv (62 dòng × 5 cột). </w:t>
       </w:r>
       <w:r>
-        <w:t>Mỗi dòng là một cặp tag–giai đoạn. Tệp gồm 31 tag được theo dõi ở hai giai đoạn: 25 tag lập trình và sáu tag AI/LLM. Tag (chuỗi) là tên nhãn; Period (chuỗi) là Before hoặc After; Questions (số nguyên) đếm câu hỏi gắn nhãn; Months (số nguyên) là 23 hoặc 37 tháng; Group (chuỗi) phân loại Programming hoặc AI/LLM. Nhóm chọn các tag ứng viên từ mẫu rồi truy vấn API để đếm câu hỏi theo tag và giai đoạn. Tệp không có giá trị khuyết, mỗi cặp Tag–Period là duy nhất; một câu hỏi có thể mang nhiều tag.</w:t>
+        <w:t>Mỗi dòng là một cặp tag–giai đoạn. Nhóm chọn các tag ứng viên từ mẫu rồi truy vấn API để đếm câu hỏi theo tag và giai đoạn. Tệp theo dõi 25 tag lập trình và sáu tag AI/LLM; không có giá trị khuyết, mỗi cặp Tag–Period là duy nhất. Một câu hỏi có thể mang nhiều tag. Bảng 3 giải thích năm cột của tệp.</w:t>
       </w:r>
     </w:p>
     <w:p>
       <w:pPr>
+        <w:pStyle w:val="BT"/>
+        <w:jc w:val="center"/>
+      </w:pPr>
+      <w:r>
+        <w:t>Bảng 3. Năm cột của so_tag_counts.csv</w:t>
+      </w:r>
+    </w:p>
+    <w:tbl>
+      <w:tblPr>
+        <w:tblStyle w:val="new"/>
+        <w:tblW w:w="0" w:type="auto"/>
+        <w:tblLayout w:type="fixed"/>
+        <w:tblLook w:val="04A0" w:firstRow="1" w:lastRow="0" w:firstColumn="1" w:lastColumn="0" w:noHBand="0" w:noVBand="1"/>
+      </w:tblPr>
+      <w:tblGrid>
+        <w:gridCol w:w="680"/>
+        <w:gridCol w:w="2041"/>
+        <w:gridCol w:w="1417"/>
+        <w:gridCol w:w="1587"/>
+        <w:gridCol w:w="3175"/>
+      </w:tblGrid>
+      <w:tr>
+        <w:trPr>
+          <w:cnfStyle w:val="100000000000" w:firstRow="1" w:lastRow="0" w:firstColumn="0" w:lastColumn="0" w:oddVBand="0" w:evenVBand="0" w:oddHBand="0" w:evenHBand="0" w:firstRowFirstColumn="0" w:firstRowLastColumn="0" w:lastRowFirstColumn="0" w:lastRowLastColumn="0"/>
+          <w:tblHeader/>
+        </w:trPr>
+        <w:tc>
+          <w:tcPr>
+            <w:tcW w:w="680" w:type="dxa"/>
+          </w:tcPr>
+          <w:p>
+            <w:pPr>
+              <w:spacing w:after="0" w:line="240" w:lineRule="auto"/>
+              <w:jc w:val="left"/>
+            </w:pPr>
+            <w:r>
+              <w:rPr>
+                <w:color w:val="FF0000"/>
+                <w:sz w:val="21"/>
+              </w:rPr>
+              <w:t>STT</w:t>
+            </w:r>
+          </w:p>
+        </w:tc>
+        <w:tc>
+          <w:tcPr>
+            <w:tcW w:w="2041" w:type="dxa"/>
+          </w:tcPr>
+          <w:p>
+            <w:pPr>
+              <w:spacing w:after="0" w:line="240" w:lineRule="auto"/>
+              <w:jc w:val="left"/>
+            </w:pPr>
+            <w:proofErr w:type="spellStart"/>
+            <w:r>
+              <w:rPr>
+                <w:color w:val="FF0000"/>
+                <w:sz w:val="21"/>
+              </w:rPr>
+              <w:t>Tên</w:t>
+            </w:r>
+            <w:proofErr w:type="spellEnd"/>
+            <w:r>
+              <w:rPr>
+                <w:color w:val="FF0000"/>
+                <w:sz w:val="21"/>
+              </w:rPr>
+              <w:t xml:space="preserve"> </w:t>
+            </w:r>
+            <w:proofErr w:type="spellStart"/>
+            <w:r>
+              <w:rPr>
+                <w:color w:val="FF0000"/>
+                <w:sz w:val="21"/>
+              </w:rPr>
+              <w:t>cột</w:t>
+            </w:r>
+            <w:proofErr w:type="spellEnd"/>
+          </w:p>
+        </w:tc>
+        <w:tc>
+          <w:tcPr>
+            <w:tcW w:w="1417" w:type="dxa"/>
+          </w:tcPr>
+          <w:p>
+            <w:pPr>
+              <w:spacing w:after="0" w:line="240" w:lineRule="auto"/>
+              <w:jc w:val="left"/>
+            </w:pPr>
+            <w:proofErr w:type="spellStart"/>
+            <w:r>
+              <w:rPr>
+                <w:color w:val="FF0000"/>
+                <w:sz w:val="21"/>
+              </w:rPr>
+              <w:t>Kiểu</w:t>
+            </w:r>
+            <w:proofErr w:type="spellEnd"/>
+            <w:r>
+              <w:rPr>
+                <w:color w:val="FF0000"/>
+                <w:sz w:val="21"/>
+              </w:rPr>
+              <w:t xml:space="preserve"> </w:t>
+            </w:r>
+            <w:proofErr w:type="spellStart"/>
+            <w:r>
+              <w:rPr>
+                <w:color w:val="FF0000"/>
+                <w:sz w:val="21"/>
+              </w:rPr>
+              <w:t>dữ</w:t>
+            </w:r>
+            <w:proofErr w:type="spellEnd"/>
+            <w:r>
+              <w:rPr>
+                <w:color w:val="FF0000"/>
+                <w:sz w:val="21"/>
+              </w:rPr>
+              <w:t xml:space="preserve"> </w:t>
+            </w:r>
+            <w:proofErr w:type="spellStart"/>
+            <w:r>
+              <w:rPr>
+                <w:color w:val="FF0000"/>
+                <w:sz w:val="21"/>
+              </w:rPr>
+              <w:t>liệu</w:t>
+            </w:r>
+            <w:proofErr w:type="spellEnd"/>
+          </w:p>
+        </w:tc>
+        <w:tc>
+          <w:tcPr>
+            <w:tcW w:w="1587" w:type="dxa"/>
+          </w:tcPr>
+          <w:p>
+            <w:pPr>
+              <w:spacing w:after="0" w:line="240" w:lineRule="auto"/>
+              <w:jc w:val="left"/>
+            </w:pPr>
+            <w:r>
+              <w:rPr>
+                <w:color w:val="FF0000"/>
+                <w:sz w:val="21"/>
+              </w:rPr>
+              <w:t>Phạm vi</w:t>
+            </w:r>
+          </w:p>
+        </w:tc>
+        <w:tc>
+          <w:tcPr>
+            <w:tcW w:w="3175" w:type="dxa"/>
+          </w:tcPr>
+          <w:p>
+            <w:pPr>
+              <w:spacing w:after="0" w:line="240" w:lineRule="auto"/>
+              <w:jc w:val="left"/>
+            </w:pPr>
+            <w:proofErr w:type="spellStart"/>
+            <w:r>
+              <w:rPr>
+                <w:color w:val="FF0000"/>
+                <w:sz w:val="21"/>
+              </w:rPr>
+              <w:t>Giải</w:t>
+            </w:r>
+            <w:proofErr w:type="spellEnd"/>
+            <w:r>
+              <w:rPr>
+                <w:color w:val="FF0000"/>
+                <w:sz w:val="21"/>
+              </w:rPr>
+              <w:t xml:space="preserve"> </w:t>
+            </w:r>
+            <w:proofErr w:type="spellStart"/>
+            <w:r>
+              <w:rPr>
+                <w:color w:val="FF0000"/>
+                <w:sz w:val="21"/>
+              </w:rPr>
+              <w:t>thích</w:t>
+            </w:r>
+            <w:proofErr w:type="spellEnd"/>
+          </w:p>
+        </w:tc>
+      </w:tr>
+      <w:tr>
+        <w:tc>
+          <w:tcPr>
+            <w:tcW w:w="680" w:type="dxa"/>
+          </w:tcPr>
+          <w:p>
+            <w:pPr>
+              <w:spacing w:after="0" w:line="240" w:lineRule="auto"/>
+              <w:jc w:val="left"/>
+            </w:pPr>
+            <w:r>
+              <w:rPr>
+                <w:sz w:val="21"/>
+              </w:rPr>
+              <w:t>1</w:t>
+            </w:r>
+          </w:p>
+        </w:tc>
+        <w:tc>
+          <w:tcPr>
+            <w:tcW w:w="2041" w:type="dxa"/>
+          </w:tcPr>
+          <w:p>
+            <w:pPr>
+              <w:spacing w:after="0" w:line="240" w:lineRule="auto"/>
+              <w:jc w:val="left"/>
+            </w:pPr>
+            <w:r>
+              <w:rPr>
+                <w:sz w:val="21"/>
+              </w:rPr>
+              <w:t>Tag</w:t>
+            </w:r>
+          </w:p>
+        </w:tc>
+        <w:tc>
+          <w:tcPr>
+            <w:tcW w:w="1417" w:type="dxa"/>
+          </w:tcPr>
+          <w:p>
+            <w:pPr>
+              <w:spacing w:after="0" w:line="240" w:lineRule="auto"/>
+              <w:jc w:val="left"/>
+            </w:pPr>
+            <w:proofErr w:type="spellStart"/>
+            <w:r>
+              <w:rPr>
+                <w:sz w:val="21"/>
+              </w:rPr>
+              <w:t>Chuỗi</w:t>
+            </w:r>
+            <w:proofErr w:type="spellEnd"/>
+            <w:r>
+              <w:rPr>
+                <w:sz w:val="21"/>
+              </w:rPr>
+            </w:r>
+            <w:proofErr w:type="spellStart"/>
+            <w:r>
+              <w:rPr>
+                <w:sz w:val="21"/>
+              </w:rPr>
+            </w:r>
+            <w:proofErr w:type="spellEnd"/>
+          </w:p>
+        </w:tc>
+        <w:tc>
+          <w:tcPr>
+            <w:tcW w:w="1587" w:type="dxa"/>
+          </w:tcPr>
+          <w:p>
+            <w:pPr>
+              <w:spacing w:after="0" w:line="240" w:lineRule="auto"/>
+              <w:jc w:val="left"/>
+            </w:pPr>
+            <w:r>
+              <w:rPr>
+                <w:sz w:val="21"/>
+              </w:rPr>
+              <w:t>31 tag</w:t>
+            </w:r>
+            <w:proofErr w:type="spellStart"/>
+            <w:r>
+              <w:rPr>
+                <w:sz w:val="21"/>
+              </w:rPr>
+            </w:r>
+            <w:proofErr w:type="spellEnd"/>
+          </w:p>
+        </w:tc>
+        <w:tc>
+          <w:tcPr>
+            <w:tcW w:w="3175" w:type="dxa"/>
+          </w:tcPr>
+          <w:p>
+            <w:pPr>
+              <w:spacing w:after="0" w:line="240" w:lineRule="auto"/>
+              <w:jc w:val="left"/>
+            </w:pPr>
+            <w:proofErr w:type="spellStart"/>
+            <w:r>
+              <w:rPr>
+                <w:sz w:val="21"/>
+              </w:rPr>
+              <w:t>Tên tag được theo dõi.</w:t>
+            </w:r>
+            <w:proofErr w:type="spellEnd"/>
+            <w:r>
+              <w:rPr>
+                <w:sz w:val="21"/>
+              </w:rPr>
+            </w:r>
+            <w:proofErr w:type="spellStart"/>
+            <w:r>
+              <w:rPr>
+                <w:sz w:val="21"/>
+              </w:rPr>
+            </w:r>
+            <w:proofErr w:type="spellEnd"/>
+            <w:r>
+              <w:rPr>
+                <w:sz w:val="21"/>
+              </w:rPr>
+            </w:r>
+            <w:proofErr w:type="spellStart"/>
+            <w:r>
+              <w:rPr>
+                <w:sz w:val="21"/>
+              </w:rPr>
+            </w:r>
+            <w:proofErr w:type="spellEnd"/>
+            <w:r>
+              <w:rPr>
+                <w:sz w:val="21"/>
+              </w:rPr>
+            </w:r>
+            <w:proofErr w:type="spellStart"/>
+            <w:r>
+              <w:rPr>
+                <w:sz w:val="21"/>
+              </w:rPr>
+            </w:r>
+            <w:proofErr w:type="spellEnd"/>
+            <w:r>
+              <w:rPr>
+                <w:sz w:val="21"/>
+              </w:rPr>
+            </w:r>
+          </w:p>
+        </w:tc>
+      </w:tr>
+      <w:tr>
+        <w:tc>
+          <w:tcPr>
+            <w:tcW w:w="680" w:type="dxa"/>
+          </w:tcPr>
+          <w:p>
+            <w:pPr>
+              <w:spacing w:after="0" w:line="240" w:lineRule="auto"/>
+              <w:jc w:val="left"/>
+            </w:pPr>
+            <w:r>
+              <w:rPr>
+                <w:sz w:val="21"/>
+              </w:rPr>
+              <w:t>2</w:t>
+            </w:r>
+          </w:p>
+        </w:tc>
+        <w:tc>
+          <w:tcPr>
+            <w:tcW w:w="2041" w:type="dxa"/>
+          </w:tcPr>
+          <w:p>
+            <w:pPr>
+              <w:spacing w:after="0" w:line="240" w:lineRule="auto"/>
+              <w:jc w:val="left"/>
+            </w:pPr>
+            <w:proofErr w:type="spellStart"/>
+            <w:r>
+              <w:rPr>
+                <w:sz w:val="21"/>
+              </w:rPr>
+              <w:t>Period</w:t>
+            </w:r>
+            <w:proofErr w:type="spellEnd"/>
+          </w:p>
+        </w:tc>
+        <w:tc>
+          <w:tcPr>
+            <w:tcW w:w="1417" w:type="dxa"/>
+          </w:tcPr>
+          <w:p>
+            <w:pPr>
+              <w:spacing w:after="0" w:line="240" w:lineRule="auto"/>
+              <w:jc w:val="left"/>
+            </w:pPr>
+            <w:proofErr w:type="spellStart"/>
+            <w:r>
+              <w:rPr>
+                <w:sz w:val="21"/>
+              </w:rPr>
+              <w:t>Chuỗi</w:t>
+            </w:r>
+            <w:proofErr w:type="spellEnd"/>
+            <w:r>
+              <w:rPr>
+                <w:sz w:val="21"/>
+              </w:rPr>
+            </w:r>
+            <w:proofErr w:type="spellStart"/>
+            <w:r>
+              <w:rPr>
+                <w:sz w:val="21"/>
+              </w:rPr>
+            </w:r>
+            <w:proofErr w:type="spellEnd"/>
+          </w:p>
+        </w:tc>
+        <w:tc>
+          <w:tcPr>
+            <w:tcW w:w="1587" w:type="dxa"/>
+          </w:tcPr>
+          <w:p>
+            <w:pPr>
+              <w:spacing w:after="0" w:line="240" w:lineRule="auto"/>
+              <w:jc w:val="left"/>
+            </w:pPr>
+            <w:r>
+              <w:rPr>
+                <w:sz w:val="21"/>
+              </w:rPr>
+              <w:t>Before/After</w:t>
+            </w:r>
+          </w:p>
+        </w:tc>
+        <w:tc>
+          <w:tcPr>
+            <w:tcW w:w="3175" w:type="dxa"/>
+          </w:tcPr>
+          <w:p>
+            <w:pPr>
+              <w:spacing w:after="0" w:line="240" w:lineRule="auto"/>
+              <w:jc w:val="left"/>
+            </w:pPr>
+            <w:proofErr w:type="spellStart"/>
+            <w:r>
+              <w:rPr>
+                <w:sz w:val="21"/>
+              </w:rPr>
+              <w:t>Giai đoạn đếm câu hỏi.</w:t>
+            </w:r>
+            <w:proofErr w:type="spellEnd"/>
+            <w:r>
+              <w:rPr>
+                <w:sz w:val="21"/>
+              </w:rPr>
+            </w:r>
+            <w:proofErr w:type="spellStart"/>
+            <w:r>
+              <w:rPr>
+                <w:sz w:val="21"/>
+              </w:rPr>
+            </w:r>
+            <w:proofErr w:type="spellEnd"/>
+            <w:r>
+              <w:rPr>
+                <w:sz w:val="21"/>
+              </w:rPr>
+            </w:r>
+            <w:proofErr w:type="spellStart"/>
+            <w:r>
+              <w:rPr>
+                <w:sz w:val="21"/>
+              </w:rPr>
+            </w:r>
+            <w:proofErr w:type="spellEnd"/>
+            <w:r>
+              <w:rPr>
+                <w:sz w:val="21"/>
+              </w:rPr>
+            </w:r>
+            <w:proofErr w:type="spellStart"/>
+            <w:r>
+              <w:rPr>
+                <w:sz w:val="21"/>
+              </w:rPr>
+            </w:r>
+            <w:proofErr w:type="spellEnd"/>
+            <w:r>
+              <w:rPr>
+                <w:sz w:val="21"/>
+              </w:rPr>
+            </w:r>
+          </w:p>
+        </w:tc>
+      </w:tr>
+      <w:tr>
+        <w:tc>
+          <w:tcPr>
+            <w:tcW w:w="680" w:type="dxa"/>
+          </w:tcPr>
+          <w:p>
+            <w:pPr>
+              <w:spacing w:after="0" w:line="240" w:lineRule="auto"/>
+              <w:jc w:val="left"/>
+            </w:pPr>
+            <w:r>
+              <w:rPr>
+                <w:sz w:val="21"/>
+              </w:rPr>
+              <w:t>3</w:t>
+            </w:r>
+          </w:p>
+        </w:tc>
+        <w:tc>
+          <w:tcPr>
+            <w:tcW w:w="2041" w:type="dxa"/>
+          </w:tcPr>
+          <w:p>
+            <w:pPr>
+              <w:spacing w:after="0" w:line="240" w:lineRule="auto"/>
+              <w:jc w:val="left"/>
+            </w:pPr>
+            <w:proofErr w:type="spellStart"/>
+            <w:r>
+              <w:rPr>
+                <w:sz w:val="21"/>
+              </w:rPr>
+              <w:t>Questions</w:t>
+            </w:r>
+            <w:proofErr w:type="spellEnd"/>
+          </w:p>
+        </w:tc>
+        <w:tc>
+          <w:tcPr>
+            <w:tcW w:w="1417" w:type="dxa"/>
+          </w:tcPr>
+          <w:p>
+            <w:pPr>
+              <w:spacing w:after="0" w:line="240" w:lineRule="auto"/>
+              <w:jc w:val="left"/>
+            </w:pPr>
+            <w:proofErr w:type="spellStart"/>
+            <w:r>
+              <w:rPr>
+                <w:sz w:val="21"/>
+              </w:rPr>
+              <w:t>Số nguyên</w:t>
+            </w:r>
+            <w:proofErr w:type="spellEnd"/>
+            <w:r>
+              <w:rPr>
+                <w:sz w:val="21"/>
+              </w:rPr>
+            </w:r>
+            <w:proofErr w:type="spellStart"/>
+            <w:r>
+              <w:rPr>
+                <w:sz w:val="21"/>
+              </w:rPr>
+            </w:r>
+            <w:proofErr w:type="spellEnd"/>
+          </w:p>
+        </w:tc>
+        <w:tc>
+          <w:tcPr>
+            <w:tcW w:w="1587" w:type="dxa"/>
+          </w:tcPr>
+          <w:p>
+            <w:pPr>
+              <w:spacing w:after="0" w:line="240" w:lineRule="auto"/>
+              <w:jc w:val="left"/>
+            </w:pPr>
+            <w:r>
+              <w:rPr>
+                <w:sz w:val="21"/>
+              </w:rPr>
+              <w:t>0–457.687</w:t>
+            </w:r>
+          </w:p>
+        </w:tc>
+        <w:tc>
+          <w:tcPr>
+            <w:tcW w:w="3175" w:type="dxa"/>
+          </w:tcPr>
+          <w:p>
+            <w:pPr>
+              <w:spacing w:after="0" w:line="240" w:lineRule="auto"/>
+              <w:jc w:val="left"/>
+            </w:pPr>
+            <w:proofErr w:type="spellStart"/>
+            <w:r>
+              <w:rPr>
+                <w:sz w:val="21"/>
+              </w:rPr>
+              <w:t>Số câu hỏi mang tag trong giai đoạn.</w:t>
+            </w:r>
+            <w:proofErr w:type="spellEnd"/>
+            <w:r>
+              <w:rPr>
+                <w:sz w:val="21"/>
+              </w:rPr>
+            </w:r>
+            <w:proofErr w:type="spellStart"/>
+            <w:r>
+              <w:rPr>
+                <w:sz w:val="21"/>
+              </w:rPr>
+            </w:r>
+            <w:proofErr w:type="spellEnd"/>
+            <w:r>
+              <w:rPr>
+                <w:sz w:val="21"/>
+              </w:rPr>
+            </w:r>
+            <w:proofErr w:type="spellStart"/>
+            <w:r>
+              <w:rPr>
+                <w:sz w:val="21"/>
+              </w:rPr>
+            </w:r>
+            <w:proofErr w:type="spellEnd"/>
+            <w:r>
+              <w:rPr>
+                <w:sz w:val="21"/>
+              </w:rPr>
+            </w:r>
+            <w:proofErr w:type="spellStart"/>
+            <w:r>
+              <w:rPr>
+                <w:sz w:val="21"/>
+              </w:rPr>
+            </w:r>
+            <w:proofErr w:type="spellEnd"/>
+            <w:r>
+              <w:rPr>
+                <w:sz w:val="21"/>
+              </w:rPr>
+            </w:r>
+            <w:proofErr w:type="spellStart"/>
+            <w:r>
+              <w:rPr>
+                <w:sz w:val="21"/>
+              </w:rPr>
+            </w:r>
+            <w:proofErr w:type="spellEnd"/>
+            <w:r>
+              <w:rPr>
+                <w:sz w:val="21"/>
+              </w:rPr>
+            </w:r>
+          </w:p>
+        </w:tc>
+      </w:tr>
+      <w:tr>
+        <w:tc>
+          <w:tcPr>
+            <w:tcW w:w="680" w:type="dxa"/>
+          </w:tcPr>
+          <w:p>
+            <w:pPr>
+              <w:spacing w:after="0" w:line="240" w:lineRule="auto"/>
+              <w:jc w:val="left"/>
+            </w:pPr>
+            <w:r>
+              <w:rPr>
+                <w:sz w:val="21"/>
+              </w:rPr>
+              <w:t>4</w:t>
+            </w:r>
+          </w:p>
+        </w:tc>
+        <w:tc>
+          <w:tcPr>
+            <w:tcW w:w="2041" w:type="dxa"/>
+          </w:tcPr>
+          <w:p>
+            <w:pPr>
+              <w:spacing w:after="0" w:line="240" w:lineRule="auto"/>
+              <w:jc w:val="left"/>
+            </w:pPr>
+            <w:r>
+              <w:rPr>
+                <w:sz w:val="21"/>
+              </w:rPr>
+              <w:t>Months</w:t>
+            </w:r>
+          </w:p>
+        </w:tc>
+        <w:tc>
+          <w:tcPr>
+            <w:tcW w:w="1417" w:type="dxa"/>
+          </w:tcPr>
+          <w:p>
+            <w:pPr>
+              <w:spacing w:after="0" w:line="240" w:lineRule="auto"/>
+              <w:jc w:val="left"/>
+            </w:pPr>
+            <w:proofErr w:type="spellStart"/>
+            <w:r>
+              <w:rPr>
+                <w:sz w:val="21"/>
+              </w:rPr>
+              <w:t>Số nguyên</w:t>
+            </w:r>
+            <w:proofErr w:type="spellEnd"/>
+            <w:r>
+              <w:rPr>
+                <w:sz w:val="21"/>
+              </w:rPr>
+            </w:r>
+            <w:proofErr w:type="spellStart"/>
+            <w:r>
+              <w:rPr>
+                <w:sz w:val="21"/>
+              </w:rPr>
+            </w:r>
+            <w:proofErr w:type="spellEnd"/>
+          </w:p>
+        </w:tc>
+        <w:tc>
+          <w:tcPr>
+            <w:tcW w:w="1587" w:type="dxa"/>
+          </w:tcPr>
+          <w:p>
+            <w:pPr>
+              <w:spacing w:after="0" w:line="240" w:lineRule="auto"/>
+              <w:jc w:val="left"/>
+            </w:pPr>
+            <w:r>
+              <w:rPr>
+                <w:sz w:val="21"/>
+              </w:rPr>
+              <w:t>23/37</w:t>
+            </w:r>
+            <w:proofErr w:type="spellStart"/>
+            <w:r>
+              <w:rPr>
+                <w:sz w:val="21"/>
+              </w:rPr>
+            </w:r>
+            <w:proofErr w:type="spellEnd"/>
+            <w:r>
+              <w:rPr>
+                <w:sz w:val="21"/>
+              </w:rPr>
+            </w:r>
+          </w:p>
+        </w:tc>
+        <w:tc>
+          <w:tcPr>
+            <w:tcW w:w="3175" w:type="dxa"/>
+          </w:tcPr>
+          <w:p>
+            <w:pPr>
+              <w:spacing w:after="0" w:line="240" w:lineRule="auto"/>
+              <w:jc w:val="left"/>
+            </w:pPr>
+            <w:proofErr w:type="spellStart"/>
+            <w:r>
+              <w:rPr>
+                <w:sz w:val="21"/>
+              </w:rPr>
+              <w:t>Số tháng của giai đoạn.</w:t>
+            </w:r>
+            <w:proofErr w:type="spellEnd"/>
+            <w:r>
+              <w:rPr>
+                <w:sz w:val="21"/>
+              </w:rPr>
+            </w:r>
+            <w:proofErr w:type="spellStart"/>
+            <w:r>
+              <w:rPr>
+                <w:sz w:val="21"/>
+              </w:rPr>
+            </w:r>
+            <w:proofErr w:type="spellEnd"/>
+            <w:r>
+              <w:rPr>
+                <w:sz w:val="21"/>
+              </w:rPr>
+            </w:r>
+            <w:proofErr w:type="spellStart"/>
+            <w:r>
+              <w:rPr>
+                <w:sz w:val="21"/>
+              </w:rPr>
+            </w:r>
+            <w:proofErr w:type="spellEnd"/>
+            <w:r>
+              <w:rPr>
+                <w:sz w:val="21"/>
+              </w:rPr>
+            </w:r>
+            <w:proofErr w:type="spellStart"/>
+            <w:r>
+              <w:rPr>
+                <w:sz w:val="21"/>
+              </w:rPr>
+            </w:r>
+            <w:proofErr w:type="spellEnd"/>
+            <w:r>
+              <w:rPr>
+                <w:sz w:val="21"/>
+              </w:rPr>
+            </w:r>
+          </w:p>
+        </w:tc>
+      </w:tr>
+      <w:tr>
+        <w:tc>
+          <w:tcPr>
+            <w:tcW w:w="680" w:type="dxa"/>
+          </w:tcPr>
+          <w:p>
+            <w:pPr>
+              <w:spacing w:after="0" w:line="240" w:lineRule="auto"/>
+              <w:jc w:val="left"/>
+            </w:pPr>
+            <w:r>
+              <w:rPr>
+                <w:sz w:val="21"/>
+              </w:rPr>
+              <w:t>5</w:t>
+            </w:r>
+          </w:p>
+        </w:tc>
+        <w:tc>
+          <w:tcPr>
+            <w:tcW w:w="2041" w:type="dxa"/>
+          </w:tcPr>
+          <w:p>
+            <w:pPr>
+              <w:spacing w:after="0" w:line="240" w:lineRule="auto"/>
+              <w:jc w:val="left"/>
+            </w:pPr>
+            <w:proofErr w:type="spellStart"/>
+            <w:r>
+              <w:rPr>
+                <w:sz w:val="21"/>
+              </w:rPr>
+              <w:t>Group</w:t>
+            </w:r>
+            <w:proofErr w:type="spellEnd"/>
+          </w:p>
+        </w:tc>
+        <w:tc>
+          <w:tcPr>
+            <w:tcW w:w="1417" w:type="dxa"/>
+          </w:tcPr>
+          <w:p>
+            <w:pPr>
+              <w:spacing w:after="0" w:line="240" w:lineRule="auto"/>
+              <w:jc w:val="left"/>
+            </w:pPr>
+            <w:proofErr w:type="spellStart"/>
+            <w:r>
+              <w:rPr>
+                <w:sz w:val="21"/>
+              </w:rPr>
+              <w:t>Chuỗi</w:t>
+            </w:r>
+            <w:proofErr w:type="spellEnd"/>
+            <w:r>
+              <w:rPr>
+                <w:sz w:val="21"/>
+              </w:rPr>
+            </w:r>
+            <w:proofErr w:type="spellStart"/>
+            <w:r>
+              <w:rPr>
+                <w:sz w:val="21"/>
+              </w:rPr>
+            </w:r>
+            <w:proofErr w:type="spellEnd"/>
+          </w:p>
+        </w:tc>
+        <w:tc>
+          <w:tcPr>
+            <w:tcW w:w="1587" w:type="dxa"/>
+          </w:tcPr>
+          <w:p>
+            <w:pPr>
+              <w:spacing w:after="0" w:line="240" w:lineRule="auto"/>
+              <w:jc w:val="left"/>
+            </w:pPr>
+            <w:r>
+              <w:rPr>
+                <w:sz w:val="21"/>
+              </w:rPr>
+              <w:t>Programming; AI/LLM</w:t>
+            </w:r>
+          </w:p>
+        </w:tc>
+        <w:tc>
+          <w:tcPr>
+            <w:tcW w:w="3175" w:type="dxa"/>
+          </w:tcPr>
+          <w:p>
+            <w:pPr>
+              <w:spacing w:after="0" w:line="240" w:lineRule="auto"/>
+              <w:jc w:val="left"/>
+            </w:pPr>
+            <w:proofErr w:type="spellStart"/>
+            <w:r>
+              <w:rPr>
+                <w:sz w:val="21"/>
+              </w:rPr>
+              <w:t>Nhóm tag lập trình hoặc AI/LLM.</w:t>
+            </w:r>
+            <w:proofErr w:type="spellEnd"/>
+            <w:r>
+              <w:rPr>
+                <w:sz w:val="21"/>
+              </w:rPr>
+            </w:r>
+            <w:proofErr w:type="spellStart"/>
+            <w:r>
+              <w:rPr>
+                <w:sz w:val="21"/>
+              </w:rPr>
+            </w:r>
+            <w:proofErr w:type="spellEnd"/>
+            <w:r>
+              <w:rPr>
+                <w:sz w:val="21"/>
+              </w:rPr>
+            </w:r>
+            <w:proofErr w:type="spellStart"/>
+            <w:r>
+              <w:rPr>
+                <w:sz w:val="21"/>
+              </w:rPr>
+            </w:r>
+            <w:proofErr w:type="spellEnd"/>
+            <w:r>
+              <w:rPr>
+                <w:sz w:val="21"/>
+              </w:rPr>
+            </w:r>
+            <w:proofErr w:type="spellStart"/>
+            <w:r>
+              <w:rPr>
+                <w:sz w:val="21"/>
+              </w:rPr>
+            </w:r>
+            <w:proofErr w:type="spellEnd"/>
+            <w:r>
+              <w:rPr>
+                <w:sz w:val="21"/>
+              </w:rPr>
+            </w:r>
+            <w:proofErr w:type="spellStart"/>
+            <w:r>
+              <w:rPr>
+                <w:sz w:val="21"/>
+              </w:rPr>
+            </w:r>
+            <w:proofErr w:type="spellEnd"/>
+            <w:r>
+              <w:rPr>
+                <w:sz w:val="21"/>
+              </w:rPr>
+            </w:r>
+          </w:p>
+        </w:tc>
+      </w:tr>
+    </w:tbl>
+    <w:p>
+      <w:pPr>
         <w:pStyle w:val="Heading1"/>
+        <w:spacing w:before="120"/>
       </w:pPr>
       <w:r>
         <w:tab/>
@@ -4283,6 +5888,7 @@
     <w:p>
       <w:pPr>
         <w:pStyle w:val="BT"/>
+        <w:keepLines/>
       </w:pPr>
       <w:proofErr w:type="spellStart"/>
       <w:r>
@@ -4947,7 +6553,7 @@
         <w:pStyle w:val="BT"/>
       </w:pPr>
       <w:r>
-        <w:t>Xét theo năm, số câu hỏi giảm từ 1.534.282 năm 2021 xuống 109.759 năm 2025, tương đương mức giảm 92,8%. Số câu trả lời cùng kỳ giảm từ 1.986.284 xuống 188.478. Bảng 2 trình bày cả tổng số và mức bình quân tháng để thấy quy mô thay đổi trong từng năm, không chỉ chênh lệch giữa hai giai đoạn lớn.</w:t>
+        <w:t>Xét theo năm, số câu hỏi giảm từ 1.534.282 năm 2021 xuống 109.759 năm 2025, tương đương mức giảm 92,8%. Số câu trả lời cùng kỳ giảm từ 1.986.284 xuống 188.478. Bảng 4 trình bày cả tổng số và mức bình quân tháng để thấy quy mô thay đổi trong từng năm, không chỉ chênh lệch giữa hai giai đoạn lớn.</w:t>
       </w:r>
     </w:p>
     <w:p>
@@ -4959,7 +6565,7 @@
         <w:rPr>
           <w:i/>
         </w:rPr>
-        <w:t>Bảng 2. Số câu hỏi và câu trả lời theo năm</w:t>
+        <w:t>Bảng 4. Số câu hỏi và câu trả lời theo năm</w:t>
       </w:r>
     </w:p>
     <w:tbl>
@@ -5969,7 +7575,7 @@
         <w:pStyle w:val="BT"/>
       </w:pPr>
       <w:r>
-        <w:t>Năm 2022 gồm 11 tháng Before AI và một tháng After AI. Vì vậy, Bảng 2 dùng để nhìn diễn biến theo năm; các tỷ lệ trước và sau ở phần kết quả vẫn tính theo 23 và 37 tháng.</w:t>
+        <w:t>Năm 2022 gồm 11 tháng Before AI và một tháng After AI. Vì vậy, Bảng 4 dùng để nhìn diễn biến theo năm; các tỷ lệ trước và sau ở phần kết quả vẫn tính theo 23 và 37 tháng.</w:t>
       </w:r>
     </w:p>
     <w:p>
@@ -7411,6 +9017,7 @@
     <w:p>
       <w:pPr>
         <w:pStyle w:val="Heading2"/>
+        <w:keepNext/>
       </w:pPr>
       <w:proofErr w:type="spellStart"/>
       <w:r>
@@ -7501,6 +9108,7 @@
     <w:p>
       <w:pPr>
         <w:pStyle w:val="BT"/>
+        <w:keepLines/>
       </w:pPr>
       <w:r>
         <w:t xml:space="preserve">Score </w:t>

</xml_diff>

<commit_message>
Update figures and descriptions in the report to reflect recent analysis findings
</commit_message>
<xml_diff>
--- a/Nhom6_Bao_cao.docx
+++ b/Nhom6_Bao_cao.docx
@@ -9016,6 +9016,60 @@
     </w:p>
     <w:p>
       <w:pPr>
+        <w:pStyle w:val="BT"/>
+        <w:keepNext/>
+        <w:jc w:val="center"/>
+      </w:pPr>
+      <w:r>
+        <w:drawing>
+          <wp:inline xmlns:a="http://schemas.openxmlformats.org/drawingml/2006/main" xmlns:pic="http://schemas.openxmlformats.org/drawingml/2006/picture">
+            <wp:extent cx="5687568" cy="1991755"/>
+            <wp:docPr id="294690994" name="Picture 294690994" descr="Hai biểu đồ so sánh số câu trả lời trên mỗi câu hỏi theo hai cách tính trước và sau tháng 12 năm 2022"/>
+            <wp:cNvGraphicFramePr>
+              <a:graphicFrameLocks noChangeAspect="1"/>
+            </wp:cNvGraphicFramePr>
+            <a:graphic>
+              <a:graphicData uri="http://schemas.openxmlformats.org/drawingml/2006/picture">
+                <pic:pic>
+                  <pic:nvPicPr>
+                    <pic:cNvPr id="0" name="image.png"/>
+                    <pic:cNvPicPr/>
+                  </pic:nvPicPr>
+                  <pic:blipFill>
+                    <a:blip r:embed="rId25"/>
+                    <a:stretch>
+                      <a:fillRect/>
+                    </a:stretch>
+                  </pic:blipFill>
+                  <pic:spPr>
+                    <a:xfrm>
+                      <a:off x="0" y="0"/>
+                      <a:ext cx="5687568" cy="1991755"/>
+                    </a:xfrm>
+                    <a:prstGeom prst="rect"/>
+                  </pic:spPr>
+                </pic:pic>
+              </a:graphicData>
+            </a:graphic>
+          </wp:inline>
+        </w:drawing>
+      </w:r>
+    </w:p>
+    <w:p>
+      <w:pPr>
+        <w:pStyle w:val="BT"/>
+        <w:keepLines/>
+        <w:jc w:val="center"/>
+      </w:pPr>
+      <w:r>
+        <w:rPr>
+          <w:i/>
+        </w:rPr>
+        <w:t>Hình 4. Số câu trả lời trên mỗi câu hỏi theo hai cách tính</w:t>
+      </w:r>
+    </w:p>
+    <w:p>
+      <w:pPr>
         <w:pStyle w:val="Heading2"/>
         <w:keepNext/>
       </w:pPr>
@@ -9694,140 +9748,12 @@
         <w:pStyle w:val="BT"/>
         <w:jc w:val="center"/>
       </w:pPr>
-      <w:proofErr w:type="spellStart"/>
       <w:r>
         <w:rPr>
           <w:i/>
         </w:rPr>
-        <w:t>Hình</w:t>
-      </w:r>
-      <w:proofErr w:type="spellEnd"/>
-      <w:r>
-        <w:rPr>
-          <w:i/>
-        </w:rPr>
-        <w:t xml:space="preserve"> 4. Score </w:t>
-      </w:r>
-      <w:proofErr w:type="spellStart"/>
-      <w:r>
-        <w:rPr>
-          <w:i/>
-        </w:rPr>
-        <w:t>trung</w:t>
-      </w:r>
-      <w:proofErr w:type="spellEnd"/>
-      <w:r>
-        <w:rPr>
-          <w:i/>
-        </w:rPr>
-        <w:t xml:space="preserve"> </w:t>
-      </w:r>
-      <w:proofErr w:type="spellStart"/>
-      <w:r>
-        <w:rPr>
-          <w:i/>
-        </w:rPr>
-        <w:t>bình</w:t>
-      </w:r>
-      <w:proofErr w:type="spellEnd"/>
-      <w:r>
-        <w:rPr>
-          <w:i/>
-        </w:rPr>
-        <w:t xml:space="preserve"> </w:t>
-      </w:r>
-      <w:proofErr w:type="spellStart"/>
-      <w:r>
-        <w:rPr>
-          <w:i/>
-        </w:rPr>
-        <w:t>và</w:t>
-      </w:r>
-      <w:proofErr w:type="spellEnd"/>
-      <w:r>
-        <w:rPr>
-          <w:i/>
-        </w:rPr>
-        <w:t xml:space="preserve"> </w:t>
-      </w:r>
-      <w:proofErr w:type="spellStart"/>
-      <w:r>
-        <w:rPr>
-          <w:i/>
-        </w:rPr>
-        <w:t>tỷ</w:t>
-      </w:r>
-      <w:proofErr w:type="spellEnd"/>
-      <w:r>
-        <w:rPr>
-          <w:i/>
-        </w:rPr>
-        <w:t xml:space="preserve"> </w:t>
-      </w:r>
-      <w:proofErr w:type="spellStart"/>
-      <w:r>
-        <w:rPr>
-          <w:i/>
-        </w:rPr>
-        <w:t>lệ</w:t>
-      </w:r>
-      <w:proofErr w:type="spellEnd"/>
-      <w:r>
-        <w:rPr>
-          <w:i/>
-        </w:rPr>
-        <w:t xml:space="preserve"> </w:t>
-      </w:r>
-      <w:proofErr w:type="spellStart"/>
-      <w:r>
-        <w:rPr>
-          <w:i/>
-        </w:rPr>
-        <w:t>câu</w:t>
-      </w:r>
-      <w:proofErr w:type="spellEnd"/>
-      <w:r>
-        <w:rPr>
-          <w:i/>
-        </w:rPr>
-        <w:t xml:space="preserve"> </w:t>
-      </w:r>
-      <w:proofErr w:type="spellStart"/>
-      <w:r>
-        <w:rPr>
-          <w:i/>
-        </w:rPr>
-        <w:t>hỏi</w:t>
-      </w:r>
-      <w:proofErr w:type="spellEnd"/>
-      <w:r>
-        <w:rPr>
-          <w:i/>
-        </w:rPr>
-        <w:t xml:space="preserve"> </w:t>
-      </w:r>
-      <w:proofErr w:type="spellStart"/>
-      <w:r>
-        <w:rPr>
-          <w:i/>
-        </w:rPr>
-        <w:t>có</w:t>
-      </w:r>
-      <w:proofErr w:type="spellEnd"/>
-      <w:r>
-        <w:rPr>
-          <w:i/>
-        </w:rPr>
-        <w:t xml:space="preserve"> Score </w:t>
-      </w:r>
-      <w:proofErr w:type="spellStart"/>
-      <w:r>
-        <w:rPr>
-          <w:i/>
-        </w:rPr>
-        <w:t>dương</w:t>
-      </w:r>
-      <w:proofErr w:type="spellEnd"/>
+        <w:t>Hình 5. Score trung bình và tỷ lệ câu hỏi có Score dương</w:t>
+      </w:r>
     </w:p>
     <w:p>
       <w:pPr>
@@ -9934,98 +9860,12 @@
         <w:pStyle w:val="BT"/>
         <w:jc w:val="center"/>
       </w:pPr>
-      <w:proofErr w:type="spellStart"/>
       <w:r>
         <w:rPr>
           <w:i/>
         </w:rPr>
-        <w:t>Hình</w:t>
-      </w:r>
-      <w:proofErr w:type="spellEnd"/>
-      <w:r>
-        <w:rPr>
-          <w:i/>
-        </w:rPr>
-        <w:t xml:space="preserve"> 5. Thay </w:t>
-      </w:r>
-      <w:proofErr w:type="spellStart"/>
-      <w:r>
-        <w:rPr>
-          <w:i/>
-        </w:rPr>
-        <w:t>đổi</w:t>
-      </w:r>
-      <w:proofErr w:type="spellEnd"/>
-      <w:r>
-        <w:rPr>
-          <w:i/>
-        </w:rPr>
-        <w:t xml:space="preserve"> </w:t>
-      </w:r>
-      <w:proofErr w:type="spellStart"/>
-      <w:r>
-        <w:rPr>
-          <w:i/>
-        </w:rPr>
-        <w:t>tỷ</w:t>
-      </w:r>
-      <w:proofErr w:type="spellEnd"/>
-      <w:r>
-        <w:rPr>
-          <w:i/>
-        </w:rPr>
-        <w:t xml:space="preserve"> </w:t>
-      </w:r>
-      <w:proofErr w:type="spellStart"/>
-      <w:r>
-        <w:rPr>
-          <w:i/>
-        </w:rPr>
-        <w:t>trọng</w:t>
-      </w:r>
-      <w:proofErr w:type="spellEnd"/>
-      <w:r>
-        <w:rPr>
-          <w:i/>
-        </w:rPr>
-        <w:t xml:space="preserve"> </w:t>
-      </w:r>
-      <w:proofErr w:type="spellStart"/>
-      <w:r>
-        <w:rPr>
-          <w:i/>
-        </w:rPr>
-        <w:t>của</w:t>
-      </w:r>
-      <w:proofErr w:type="spellEnd"/>
-      <w:r>
-        <w:rPr>
-          <w:i/>
-        </w:rPr>
-        <w:t xml:space="preserve"> 25 tag </w:t>
-      </w:r>
-      <w:proofErr w:type="spellStart"/>
-      <w:r>
-        <w:rPr>
-          <w:i/>
-        </w:rPr>
-        <w:t>công</w:t>
-      </w:r>
-      <w:proofErr w:type="spellEnd"/>
-      <w:r>
-        <w:rPr>
-          <w:i/>
-        </w:rPr>
-        <w:t xml:space="preserve"> </w:t>
-      </w:r>
-      <w:proofErr w:type="spellStart"/>
-      <w:r>
-        <w:rPr>
-          <w:i/>
-        </w:rPr>
-        <w:t>nghệ</w:t>
-      </w:r>
-      <w:proofErr w:type="spellEnd"/>
+        <w:t>Hình 6. Thay đổi tỷ trọng của 25 tag công nghệ</w:t>
+      </w:r>
     </w:p>
     <w:p>
       <w:pPr>

</xml_diff>